<commit_message>
v1.1: Korrekturen nach unabhaengiger Zweitpruefung
- Art. 4a: Anwendungsbeginn 27.07.2026; Abs. 1 und Abs. 2 getrennt; keine allgemeine
  Rechtsgrundlage, ersetzt keine DSGVO-Pruefung
- Anhang I Abschnitt B: Art. 6 Abs. 1 gilt weiter - 'Kapitel III gilt nicht' war zu grob
- Risikostufen als Pruefmodell statt gesetzlicher Systematik; geringes Risiko ist keine Freigabe
- Hochrisiko-Fristen durchgehend als Planungsannahme gekennzeichnet
- Arbeitsmappe: Anhang-I-Abschnitt A/B getrennt, Bestaetigungsstatus je Einstufung,
  feste Pruefdaten, eigenes Beispielblatt, Dashboard startet konsistent auf 0
- neu: LICENSE (CC BY 4.0)
</commit_message>
<xml_diff>
--- a/02_EU-AI-Act_Checklisten_Anbieter_Betreiber.docx
+++ b/02_EU-AI-Act_Checklisten_Anbieter_Betreiber.docx
@@ -55,13 +55,13 @@
           <w:bCs/>
           <w:b/>
         </w:rPr>
-        <w:t xml:space="preserve">Rechtsstand: 29. Juli 2026</w:t>
+        <w:t xml:space="preserve">Rechtsstand: 29.07.2026 · Fassung 1.1</w:t>
       </w:r>
       <w:r>
         <w:t xml:space="preserve"> </w:t>
       </w:r>
       <w:r>
-        <w:t xml:space="preserve">Verordnung (EU) 2024/1689 in der Fassung der Verordnung (EU) 2026/1744 (Digital Omnibus, in Kraft seit 27.07.2026).</w:t>
+        <w:t xml:space="preserve">Verordnung (EU) 2024/1689 in der Fassung der Verordnung (EU) 2026/1744 (Digital-Omnibus-Verordnung zur KI, in Kraft seit 27.07.2026).</w:t>
       </w:r>
     </w:p>
     <w:p>
@@ -236,6 +236,60 @@
       <w:r>
         <w:t xml:space="preserve">bedeutet, dass die Vorschrift durch den Digital Omnibus im Juli 2026 geändert wurde.</w:t>
       </w:r>
+      <w:r>
+        <w:t xml:space="preserve"> </w:t>
+      </w:r>
+      <w:r>
+        <w:t xml:space="preserve">“</w:t>
+      </w:r>
+      <w:r>
+        <w:t xml:space="preserve">UAbs.</w:t>
+      </w:r>
+      <w:r>
+        <w:t xml:space="preserve">”</w:t>
+      </w:r>
+      <w:r>
+        <w:t xml:space="preserve"> </w:t>
+      </w:r>
+      <w:r>
+        <w:t xml:space="preserve">steht für Unterabsatz,</w:t>
+      </w:r>
+      <w:r>
+        <w:t xml:space="preserve"> </w:t>
+      </w:r>
+      <w:r>
+        <w:t xml:space="preserve">“</w:t>
+      </w:r>
+      <w:r>
+        <w:t xml:space="preserve">a. F.</w:t>
+      </w:r>
+      <w:r>
+        <w:t xml:space="preserve">”</w:t>
+      </w:r>
+      <w:r>
+        <w:t xml:space="preserve"> </w:t>
+      </w:r>
+      <w:r>
+        <w:t xml:space="preserve">für alte Fassung,</w:t>
+      </w:r>
+      <w:r>
+        <w:t xml:space="preserve"> </w:t>
+      </w:r>
+      <w:r>
+        <w:t xml:space="preserve">“</w:t>
+      </w:r>
+      <w:r>
+        <w:t xml:space="preserve">ErwG</w:t>
+      </w:r>
+      <w:r>
+        <w:t xml:space="preserve">”</w:t>
+      </w:r>
+      <w:r>
+        <w:t xml:space="preserve"> </w:t>
+      </w:r>
+      <w:r>
+        <w:t xml:space="preserve">für Erwägungsgrund.</w:t>
+      </w:r>
     </w:p>
     <w:p>
       <w:pPr>
@@ -271,6 +325,122 @@
       </w:r>
       <w:r>
         <w:t xml:space="preserve">steht, ist die Pflicht bereits anwendbar. Wo ein Datum steht, ist das der Beginn der Anwendbarkeit.</w:t>
+      </w:r>
+    </w:p>
+    <w:p>
+      <w:pPr>
+        <w:pStyle w:val="BlockText"/>
+      </w:pPr>
+      <w:r>
+        <w:rPr>
+          <w:bCs/>
+          <w:b/>
+        </w:rPr>
+        <w:t xml:space="preserve">Was</w:t>
+      </w:r>
+      <w:r>
+        <w:rPr>
+          <w:bCs/>
+          <w:b/>
+        </w:rPr>
+        <w:t xml:space="preserve"> </w:t>
+      </w:r>
+      <w:r>
+        <w:rPr>
+          <w:bCs/>
+          <w:b/>
+        </w:rPr>
+        <w:t xml:space="preserve">“</w:t>
+      </w:r>
+      <w:r>
+        <w:rPr>
+          <w:bCs/>
+          <w:b/>
+        </w:rPr>
+        <w:t xml:space="preserve">HR-Frist</w:t>
+      </w:r>
+      <w:r>
+        <w:rPr>
+          <w:bCs/>
+          <w:b/>
+        </w:rPr>
+        <w:t xml:space="preserve">”</w:t>
+      </w:r>
+      <w:r>
+        <w:rPr>
+          <w:bCs/>
+          <w:b/>
+        </w:rPr>
+        <w:t xml:space="preserve"> </w:t>
+      </w:r>
+      <w:r>
+        <w:rPr>
+          <w:bCs/>
+          <w:b/>
+        </w:rPr>
+        <w:t xml:space="preserve">bedeutet — bitte einmal lesen.</w:t>
+      </w:r>
+      <w:r>
+        <w:t xml:space="preserve"> </w:t>
+      </w:r>
+      <w:r>
+        <w:t xml:space="preserve">Der Gesetzgeber hat ausdrücklich nur Kapitel III Abschnitte 1, 2 und 3 verschoben. Für einige Pflichten außerhalb dieser Abschnitte (Konformitätsbewertung, Registrierung, Beobachtung nach dem Inverkehrbringen, Vorfallmeldung, Recht auf Erläuterung) folgt aus dem Wortlaut der 02.08.2026 als Geltungsbeginn. Diese Checklisten verwenden dafür die Angabe</w:t>
+      </w:r>
+      <w:r>
+        <w:t xml:space="preserve"> </w:t>
+      </w:r>
+      <w:r>
+        <w:rPr>
+          <w:bCs/>
+          <w:b/>
+        </w:rPr>
+        <w:t xml:space="preserve">“</w:t>
+      </w:r>
+      <w:r>
+        <w:rPr>
+          <w:bCs/>
+          <w:b/>
+        </w:rPr>
+        <w:t xml:space="preserve">HR-Frist</w:t>
+      </w:r>
+      <w:r>
+        <w:rPr>
+          <w:bCs/>
+          <w:b/>
+        </w:rPr>
+        <w:t xml:space="preserve">”</w:t>
+      </w:r>
+      <w:r>
+        <w:t xml:space="preserve"> </w:t>
+      </w:r>
+      <w:r>
+        <w:t xml:space="preserve">— also den jeweiligen Hochrisiko-Termin 02.12.2027 bzw. 02.08.2028. Das ist eine</w:t>
+      </w:r>
+      <w:r>
+        <w:t xml:space="preserve"> </w:t>
+      </w:r>
+      <w:r>
+        <w:rPr>
+          <w:bCs/>
+          <w:b/>
+        </w:rPr>
+        <w:t xml:space="preserve">Planungsannahme</w:t>
+      </w:r>
+      <w:r>
+        <w:t xml:space="preserve">, keine gesicherte gesetzliche Frist: Sie beruht darauf, dass diese Pflichten ohne anwendbaren Art. 6 praktisch leerlaufen. Die Annahme ist</w:t>
+      </w:r>
+      <w:r>
+        <w:t xml:space="preserve"> </w:t>
+      </w:r>
+      <w:r>
+        <w:rPr>
+          <w:bCs/>
+          <w:b/>
+        </w:rPr>
+        <w:t xml:space="preserve">nicht anwaltlich bestätigt</w:t>
+      </w:r>
+      <w:r>
+        <w:t xml:space="preserve">. Wer sich darauf stützt, sollte für das konkrete System dokumentieren: (1) welcher Wortlaut gilt, (2) welche Frist geplant wird, (3) ob und durch wen die Auslegung geprüft wurde.</w:t>
       </w:r>
     </w:p>
     <w:p>
@@ -300,10 +470,10 @@
         <w:jc w:val="start"/>
       </w:tblPr>
       <w:tblGrid>
-        <w:gridCol w:w="2963"/>
-        <w:gridCol w:w="4872"/>
-        <w:gridCol w:w="3354"/>
-        <w:gridCol w:w="3665"/>
+        <w:gridCol w:w="2811"/>
+        <w:gridCol w:w="4621"/>
+        <w:gridCol w:w="3196"/>
+        <w:gridCol w:w="4226"/>
       </w:tblGrid>
       <w:tr>
         <w:trPr>
@@ -314,7 +484,7 @@
         <w:tc>
           <w:tcPr>
             <w:shd w:val="clear" w:color="auto" w:fill="DCE4F2"/>
-            <w:tcW w:w="2963" w:type="dxa"/>
+            <w:tcW w:w="2811" w:type="dxa"/>
           </w:tcPr>
           <w:tcPr/>
           <w:p>
@@ -330,7 +500,7 @@
         <w:tc>
           <w:tcPr>
             <w:shd w:val="clear" w:color="auto" w:fill="DCE4F2"/>
-            <w:tcW w:w="4872" w:type="dxa"/>
+            <w:tcW w:w="4621" w:type="dxa"/>
           </w:tcPr>
           <w:tcPr/>
           <w:p>
@@ -346,7 +516,7 @@
         <w:tc>
           <w:tcPr>
             <w:shd w:val="clear" w:color="auto" w:fill="DCE4F2"/>
-            <w:tcW w:w="3354" w:type="dxa"/>
+            <w:tcW w:w="3196" w:type="dxa"/>
           </w:tcPr>
           <w:tcPr/>
           <w:p>
@@ -362,7 +532,7 @@
         <w:tc>
           <w:tcPr>
             <w:shd w:val="clear" w:color="auto" w:fill="DCE4F2"/>
-            <w:tcW w:w="3665" w:type="dxa"/>
+            <w:tcW w:w="4226" w:type="dxa"/>
           </w:tcPr>
           <w:tcPr/>
           <w:p>
@@ -379,7 +549,7 @@
       <w:tr>
         <w:tc>
           <w:tcPr>
-            <w:tcW w:w="2963" w:type="dxa"/>
+            <w:tcW w:w="2811" w:type="dxa"/>
           </w:tcPr>
           <w:tcPr/>
           <w:p>
@@ -394,7 +564,7 @@
         </w:tc>
         <w:tc>
           <w:tcPr>
-            <w:tcW w:w="4872" w:type="dxa"/>
+            <w:tcW w:w="4621" w:type="dxa"/>
           </w:tcPr>
           <w:tcPr/>
           <w:p>
@@ -409,7 +579,7 @@
         </w:tc>
         <w:tc>
           <w:tcPr>
-            <w:tcW w:w="3354" w:type="dxa"/>
+            <w:tcW w:w="3196" w:type="dxa"/>
           </w:tcPr>
           <w:tcPr/>
           <w:p>
@@ -424,7 +594,7 @@
         </w:tc>
         <w:tc>
           <w:tcPr>
-            <w:tcW w:w="3665" w:type="dxa"/>
+            <w:tcW w:w="4226" w:type="dxa"/>
           </w:tcPr>
           <w:tcPr/>
           <w:p>
@@ -441,7 +611,7 @@
       <w:tr>
         <w:tc>
           <w:tcPr>
-            <w:tcW w:w="2963" w:type="dxa"/>
+            <w:tcW w:w="2811" w:type="dxa"/>
           </w:tcPr>
           <w:tcPr/>
           <w:p>
@@ -456,7 +626,7 @@
         </w:tc>
         <w:tc>
           <w:tcPr>
-            <w:tcW w:w="4872" w:type="dxa"/>
+            <w:tcW w:w="4621" w:type="dxa"/>
           </w:tcPr>
           <w:tcPr/>
           <w:p>
@@ -487,7 +657,7 @@
         </w:tc>
         <w:tc>
           <w:tcPr>
-            <w:tcW w:w="3354" w:type="dxa"/>
+            <w:tcW w:w="3196" w:type="dxa"/>
           </w:tcPr>
           <w:tcPr/>
           <w:p>
@@ -502,7 +672,7 @@
         </w:tc>
         <w:tc>
           <w:tcPr>
-            <w:tcW w:w="3665" w:type="dxa"/>
+            <w:tcW w:w="4226" w:type="dxa"/>
           </w:tcPr>
           <w:tcPr/>
           <w:p>
@@ -519,7 +689,7 @@
       <w:tr>
         <w:tc>
           <w:tcPr>
-            <w:tcW w:w="2963" w:type="dxa"/>
+            <w:tcW w:w="2811" w:type="dxa"/>
           </w:tcPr>
           <w:tcPr/>
           <w:p>
@@ -534,7 +704,7 @@
         </w:tc>
         <w:tc>
           <w:tcPr>
-            <w:tcW w:w="4872" w:type="dxa"/>
+            <w:tcW w:w="4621" w:type="dxa"/>
           </w:tcPr>
           <w:tcPr/>
           <w:p>
@@ -565,7 +735,7 @@
         </w:tc>
         <w:tc>
           <w:tcPr>
-            <w:tcW w:w="3354" w:type="dxa"/>
+            <w:tcW w:w="3196" w:type="dxa"/>
           </w:tcPr>
           <w:tcPr/>
           <w:p>
@@ -580,7 +750,7 @@
         </w:tc>
         <w:tc>
           <w:tcPr>
-            <w:tcW w:w="3665" w:type="dxa"/>
+            <w:tcW w:w="4226" w:type="dxa"/>
           </w:tcPr>
           <w:tcPr/>
           <w:p>
@@ -597,7 +767,7 @@
       <w:tr>
         <w:tc>
           <w:tcPr>
-            <w:tcW w:w="2963" w:type="dxa"/>
+            <w:tcW w:w="2811" w:type="dxa"/>
           </w:tcPr>
           <w:tcPr/>
           <w:p>
@@ -612,7 +782,7 @@
         </w:tc>
         <w:tc>
           <w:tcPr>
-            <w:tcW w:w="4872" w:type="dxa"/>
+            <w:tcW w:w="4621" w:type="dxa"/>
           </w:tcPr>
           <w:tcPr/>
           <w:p>
@@ -627,7 +797,7 @@
         </w:tc>
         <w:tc>
           <w:tcPr>
-            <w:tcW w:w="3354" w:type="dxa"/>
+            <w:tcW w:w="3196" w:type="dxa"/>
           </w:tcPr>
           <w:tcPr/>
           <w:p>
@@ -642,7 +812,7 @@
         </w:tc>
         <w:tc>
           <w:tcPr>
-            <w:tcW w:w="3665" w:type="dxa"/>
+            <w:tcW w:w="4226" w:type="dxa"/>
           </w:tcPr>
           <w:tcPr/>
           <w:p>
@@ -659,7 +829,7 @@
       <w:tr>
         <w:tc>
           <w:tcPr>
-            <w:tcW w:w="2963" w:type="dxa"/>
+            <w:tcW w:w="2811" w:type="dxa"/>
           </w:tcPr>
           <w:tcPr/>
           <w:p>
@@ -674,7 +844,7 @@
         </w:tc>
         <w:tc>
           <w:tcPr>
-            <w:tcW w:w="4872" w:type="dxa"/>
+            <w:tcW w:w="4621" w:type="dxa"/>
           </w:tcPr>
           <w:tcPr/>
           <w:p>
@@ -699,7 +869,7 @@
         </w:tc>
         <w:tc>
           <w:tcPr>
-            <w:tcW w:w="3354" w:type="dxa"/>
+            <w:tcW w:w="3196" w:type="dxa"/>
           </w:tcPr>
           <w:tcPr/>
           <w:p>
@@ -714,7 +884,7 @@
         </w:tc>
         <w:tc>
           <w:tcPr>
-            <w:tcW w:w="3665" w:type="dxa"/>
+            <w:tcW w:w="4226" w:type="dxa"/>
           </w:tcPr>
           <w:tcPr/>
           <w:p>
@@ -741,7 +911,7 @@
       <w:tr>
         <w:tc>
           <w:tcPr>
-            <w:tcW w:w="2963" w:type="dxa"/>
+            <w:tcW w:w="2811" w:type="dxa"/>
           </w:tcPr>
           <w:tcPr/>
           <w:p>
@@ -756,7 +926,7 @@
         </w:tc>
         <w:tc>
           <w:tcPr>
-            <w:tcW w:w="4872" w:type="dxa"/>
+            <w:tcW w:w="4621" w:type="dxa"/>
           </w:tcPr>
           <w:tcPr/>
           <w:p>
@@ -781,7 +951,7 @@
         </w:tc>
         <w:tc>
           <w:tcPr>
-            <w:tcW w:w="3354" w:type="dxa"/>
+            <w:tcW w:w="3196" w:type="dxa"/>
           </w:tcPr>
           <w:tcPr/>
           <w:p>
@@ -796,7 +966,7 @@
         </w:tc>
         <w:tc>
           <w:tcPr>
-            <w:tcW w:w="3665" w:type="dxa"/>
+            <w:tcW w:w="4226" w:type="dxa"/>
           </w:tcPr>
           <w:tcPr/>
           <w:p>
@@ -823,7 +993,7 @@
       <w:tr>
         <w:tc>
           <w:tcPr>
-            <w:tcW w:w="2963" w:type="dxa"/>
+            <w:tcW w:w="2811" w:type="dxa"/>
           </w:tcPr>
           <w:tcPr/>
           <w:p>
@@ -838,7 +1008,7 @@
         </w:tc>
         <w:tc>
           <w:tcPr>
-            <w:tcW w:w="4872" w:type="dxa"/>
+            <w:tcW w:w="4621" w:type="dxa"/>
           </w:tcPr>
           <w:tcPr/>
           <w:p>
@@ -853,7 +1023,7 @@
         </w:tc>
         <w:tc>
           <w:tcPr>
-            <w:tcW w:w="3354" w:type="dxa"/>
+            <w:tcW w:w="3196" w:type="dxa"/>
           </w:tcPr>
           <w:tcPr/>
           <w:p>
@@ -868,7 +1038,7 @@
         </w:tc>
         <w:tc>
           <w:tcPr>
-            <w:tcW w:w="3665" w:type="dxa"/>
+            <w:tcW w:w="4226" w:type="dxa"/>
           </w:tcPr>
           <w:tcPr/>
           <w:p>
@@ -895,7 +1065,7 @@
       <w:tr>
         <w:tc>
           <w:tcPr>
-            <w:tcW w:w="2963" w:type="dxa"/>
+            <w:tcW w:w="2811" w:type="dxa"/>
           </w:tcPr>
           <w:tcPr/>
           <w:p>
@@ -910,7 +1080,7 @@
         </w:tc>
         <w:tc>
           <w:tcPr>
-            <w:tcW w:w="4872" w:type="dxa"/>
+            <w:tcW w:w="4621" w:type="dxa"/>
           </w:tcPr>
           <w:tcPr/>
           <w:p>
@@ -925,7 +1095,7 @@
         </w:tc>
         <w:tc>
           <w:tcPr>
-            <w:tcW w:w="3354" w:type="dxa"/>
+            <w:tcW w:w="3196" w:type="dxa"/>
           </w:tcPr>
           <w:tcPr/>
           <w:p>
@@ -940,7 +1110,7 @@
         </w:tc>
         <w:tc>
           <w:tcPr>
-            <w:tcW w:w="3665" w:type="dxa"/>
+            <w:tcW w:w="4226" w:type="dxa"/>
           </w:tcPr>
           <w:tcPr/>
           <w:p>
@@ -960,6 +1130,91 @@
                 <w:b/>
               </w:rPr>
               <w:t xml:space="preserve">Checkliste D (Querschnitt) — gilt immer</w:t>
+            </w:r>
+          </w:p>
+        </w:tc>
+      </w:tr>
+      <w:tr>
+        <w:tc>
+          <w:tcPr>
+            <w:tcW w:w="2811" w:type="dxa"/>
+          </w:tcPr>
+          <w:tcPr/>
+          <w:p>
+            <w:pPr>
+              <w:pStyle w:val="Compact"/>
+              <w:jc w:val="left"/>
+            </w:pPr>
+            <w:r>
+              <w:t xml:space="preserve">0.9</w:t>
+            </w:r>
+          </w:p>
+        </w:tc>
+        <w:tc>
+          <w:tcPr>
+            <w:tcW w:w="4621" w:type="dxa"/>
+          </w:tcPr>
+          <w:tcPr/>
+          <w:p>
+            <w:pPr>
+              <w:pStyle w:val="Compact"/>
+              <w:jc w:val="left"/>
+            </w:pPr>
+            <w:r>
+              <w:t xml:space="preserve">Steht das System im Zusammenhang mit einem Produkt nach</w:t>
+            </w:r>
+            <w:r>
+              <w:t xml:space="preserve"> </w:t>
+            </w:r>
+            <w:r>
+              <w:rPr>
+                <w:bCs/>
+                <w:b/>
+              </w:rPr>
+              <w:t xml:space="preserve">Anhang I</w:t>
+            </w:r>
+            <w:r>
+              <w:t xml:space="preserve">? Wenn ja:</w:t>
+            </w:r>
+            <w:r>
+              <w:t xml:space="preserve"> </w:t>
+            </w:r>
+            <w:r>
+              <w:rPr>
+                <w:bCs/>
+                <w:b/>
+              </w:rPr>
+              <w:t xml:space="preserve">Abschnitt A oder B?</w:t>
+            </w:r>
+          </w:p>
+        </w:tc>
+        <w:tc>
+          <w:tcPr>
+            <w:tcW w:w="3196" w:type="dxa"/>
+          </w:tcPr>
+          <w:tcPr/>
+          <w:p>
+            <w:pPr>
+              <w:pStyle w:val="Compact"/>
+              <w:jc w:val="left"/>
+            </w:pPr>
+            <w:r>
+              <w:t xml:space="preserve">Anhang I, Art. 2 Abs. 2 n. F.</w:t>
+            </w:r>
+          </w:p>
+        </w:tc>
+        <w:tc>
+          <w:tcPr>
+            <w:tcW w:w="4226" w:type="dxa"/>
+          </w:tcPr>
+          <w:tcPr/>
+          <w:p>
+            <w:pPr>
+              <w:pStyle w:val="Compact"/>
+              <w:jc w:val="left"/>
+            </w:pPr>
+            <w:r>
+              <w:t xml:space="preserve">Abschnitt B → nur Art. 6 Abs. 1, Art. 60a, Art. 102–112 plus Sektorrecht; Checklisten A und B nicht anwenden</w:t>
             </w:r>
           </w:p>
         </w:tc>
@@ -6148,12 +6403,12 @@
         <w:jc w:val="start"/>
       </w:tblPr>
       <w:tblGrid>
-        <w:gridCol w:w="2016"/>
-        <w:gridCol w:w="5138"/>
-        <w:gridCol w:w="2247"/>
-        <w:gridCol w:w="1476"/>
-        <w:gridCol w:w="2435"/>
-        <w:gridCol w:w="1542"/>
+        <w:gridCol w:w="2013"/>
+        <w:gridCol w:w="5131"/>
+        <w:gridCol w:w="2264"/>
+        <w:gridCol w:w="1474"/>
+        <w:gridCol w:w="2432"/>
+        <w:gridCol w:w="1540"/>
       </w:tblGrid>
       <w:tr>
         <w:trPr>
@@ -6164,7 +6419,7 @@
         <w:tc>
           <w:tcPr>
             <w:shd w:val="clear" w:color="auto" w:fill="DCE4F2"/>
-            <w:tcW w:w="2016" w:type="dxa"/>
+            <w:tcW w:w="2013" w:type="dxa"/>
           </w:tcPr>
           <w:tcPr/>
           <w:p>
@@ -6180,7 +6435,7 @@
         <w:tc>
           <w:tcPr>
             <w:shd w:val="clear" w:color="auto" w:fill="DCE4F2"/>
-            <w:tcW w:w="5138" w:type="dxa"/>
+            <w:tcW w:w="5131" w:type="dxa"/>
           </w:tcPr>
           <w:tcPr/>
           <w:p>
@@ -6196,7 +6451,7 @@
         <w:tc>
           <w:tcPr>
             <w:shd w:val="clear" w:color="auto" w:fill="DCE4F2"/>
-            <w:tcW w:w="2247" w:type="dxa"/>
+            <w:tcW w:w="2264" w:type="dxa"/>
           </w:tcPr>
           <w:tcPr/>
           <w:p>
@@ -6212,7 +6467,7 @@
         <w:tc>
           <w:tcPr>
             <w:shd w:val="clear" w:color="auto" w:fill="DCE4F2"/>
-            <w:tcW w:w="1476" w:type="dxa"/>
+            <w:tcW w:w="1474" w:type="dxa"/>
           </w:tcPr>
           <w:tcPr/>
           <w:p>
@@ -6228,7 +6483,7 @@
         <w:tc>
           <w:tcPr>
             <w:shd w:val="clear" w:color="auto" w:fill="DCE4F2"/>
-            <w:tcW w:w="2435" w:type="dxa"/>
+            <w:tcW w:w="2432" w:type="dxa"/>
           </w:tcPr>
           <w:tcPr/>
           <w:p>
@@ -6244,7 +6499,7 @@
         <w:tc>
           <w:tcPr>
             <w:shd w:val="clear" w:color="auto" w:fill="DCE4F2"/>
-            <w:tcW w:w="1542" w:type="dxa"/>
+            <w:tcW w:w="1540" w:type="dxa"/>
           </w:tcPr>
           <w:tcPr/>
           <w:p>
@@ -6261,7 +6516,7 @@
       <w:tr>
         <w:tc>
           <w:tcPr>
-            <w:tcW w:w="2016" w:type="dxa"/>
+            <w:tcW w:w="2013" w:type="dxa"/>
           </w:tcPr>
           <w:tcPr/>
           <w:p>
@@ -6276,7 +6531,7 @@
         </w:tc>
         <w:tc>
           <w:tcPr>
-            <w:tcW w:w="5138" w:type="dxa"/>
+            <w:tcW w:w="5131" w:type="dxa"/>
           </w:tcPr>
           <w:tcPr/>
           <w:p>
@@ -6307,7 +6562,7 @@
         </w:tc>
         <w:tc>
           <w:tcPr>
-            <w:tcW w:w="2247" w:type="dxa"/>
+            <w:tcW w:w="2264" w:type="dxa"/>
           </w:tcPr>
           <w:tcPr/>
           <w:p>
@@ -6322,18 +6577,18 @@
         </w:tc>
         <w:tc>
           <w:tcPr>
-            <w:tcW w:w="1476" w:type="dxa"/>
-          </w:tcPr>
-          <w:tcPr/>
-          <w:p>
-            <w:pPr>
-              <w:pStyle w:val="Compact"/>
-            </w:pPr>
-          </w:p>
-        </w:tc>
-        <w:tc>
-          <w:tcPr>
-            <w:tcW w:w="2435" w:type="dxa"/>
+            <w:tcW w:w="1474" w:type="dxa"/>
+          </w:tcPr>
+          <w:tcPr/>
+          <w:p>
+            <w:pPr>
+              <w:pStyle w:val="Compact"/>
+            </w:pPr>
+          </w:p>
+        </w:tc>
+        <w:tc>
+          <w:tcPr>
+            <w:tcW w:w="2432" w:type="dxa"/>
           </w:tcPr>
           <w:tcPr/>
           <w:p>
@@ -6348,7 +6603,7 @@
         </w:tc>
         <w:tc>
           <w:tcPr>
-            <w:tcW w:w="1542" w:type="dxa"/>
+            <w:tcW w:w="1540" w:type="dxa"/>
           </w:tcPr>
           <w:tcPr/>
           <w:p>
@@ -6361,7 +6616,7 @@
       <w:tr>
         <w:tc>
           <w:tcPr>
-            <w:tcW w:w="2016" w:type="dxa"/>
+            <w:tcW w:w="2013" w:type="dxa"/>
           </w:tcPr>
           <w:tcPr/>
           <w:p>
@@ -6376,7 +6631,7 @@
         </w:tc>
         <w:tc>
           <w:tcPr>
-            <w:tcW w:w="5138" w:type="dxa"/>
+            <w:tcW w:w="5131" w:type="dxa"/>
           </w:tcPr>
           <w:tcPr/>
           <w:p>
@@ -6468,7 +6723,7 @@
         </w:tc>
         <w:tc>
           <w:tcPr>
-            <w:tcW w:w="2247" w:type="dxa"/>
+            <w:tcW w:w="2264" w:type="dxa"/>
           </w:tcPr>
           <w:tcPr/>
           <w:p>
@@ -6483,18 +6738,18 @@
         </w:tc>
         <w:tc>
           <w:tcPr>
-            <w:tcW w:w="1476" w:type="dxa"/>
-          </w:tcPr>
-          <w:tcPr/>
-          <w:p>
-            <w:pPr>
-              <w:pStyle w:val="Compact"/>
-            </w:pPr>
-          </w:p>
-        </w:tc>
-        <w:tc>
-          <w:tcPr>
-            <w:tcW w:w="2435" w:type="dxa"/>
+            <w:tcW w:w="1474" w:type="dxa"/>
+          </w:tcPr>
+          <w:tcPr/>
+          <w:p>
+            <w:pPr>
+              <w:pStyle w:val="Compact"/>
+            </w:pPr>
+          </w:p>
+        </w:tc>
+        <w:tc>
+          <w:tcPr>
+            <w:tcW w:w="2432" w:type="dxa"/>
           </w:tcPr>
           <w:tcPr/>
           <w:p>
@@ -6509,7 +6764,7 @@
         </w:tc>
         <w:tc>
           <w:tcPr>
-            <w:tcW w:w="1542" w:type="dxa"/>
+            <w:tcW w:w="1540" w:type="dxa"/>
           </w:tcPr>
           <w:tcPr/>
           <w:p>
@@ -6522,7 +6777,7 @@
       <w:tr>
         <w:tc>
           <w:tcPr>
-            <w:tcW w:w="2016" w:type="dxa"/>
+            <w:tcW w:w="2013" w:type="dxa"/>
           </w:tcPr>
           <w:tcPr/>
           <w:p>
@@ -6537,7 +6792,7 @@
         </w:tc>
         <w:tc>
           <w:tcPr>
-            <w:tcW w:w="5138" w:type="dxa"/>
+            <w:tcW w:w="5131" w:type="dxa"/>
           </w:tcPr>
           <w:tcPr/>
           <w:p>
@@ -6594,7 +6849,7 @@
         </w:tc>
         <w:tc>
           <w:tcPr>
-            <w:tcW w:w="2247" w:type="dxa"/>
+            <w:tcW w:w="2264" w:type="dxa"/>
           </w:tcPr>
           <w:tcPr/>
           <w:p>
@@ -6609,18 +6864,18 @@
         </w:tc>
         <w:tc>
           <w:tcPr>
-            <w:tcW w:w="1476" w:type="dxa"/>
-          </w:tcPr>
-          <w:tcPr/>
-          <w:p>
-            <w:pPr>
-              <w:pStyle w:val="Compact"/>
-            </w:pPr>
-          </w:p>
-        </w:tc>
-        <w:tc>
-          <w:tcPr>
-            <w:tcW w:w="2435" w:type="dxa"/>
+            <w:tcW w:w="1474" w:type="dxa"/>
+          </w:tcPr>
+          <w:tcPr/>
+          <w:p>
+            <w:pPr>
+              <w:pStyle w:val="Compact"/>
+            </w:pPr>
+          </w:p>
+        </w:tc>
+        <w:tc>
+          <w:tcPr>
+            <w:tcW w:w="2432" w:type="dxa"/>
           </w:tcPr>
           <w:tcPr/>
           <w:p>
@@ -6635,7 +6890,7 @@
         </w:tc>
         <w:tc>
           <w:tcPr>
-            <w:tcW w:w="1542" w:type="dxa"/>
+            <w:tcW w:w="1540" w:type="dxa"/>
           </w:tcPr>
           <w:tcPr/>
           <w:p>
@@ -6648,7 +6903,7 @@
       <w:tr>
         <w:tc>
           <w:tcPr>
-            <w:tcW w:w="2016" w:type="dxa"/>
+            <w:tcW w:w="2013" w:type="dxa"/>
           </w:tcPr>
           <w:tcPr/>
           <w:p>
@@ -6663,7 +6918,7 @@
         </w:tc>
         <w:tc>
           <w:tcPr>
-            <w:tcW w:w="5138" w:type="dxa"/>
+            <w:tcW w:w="5131" w:type="dxa"/>
           </w:tcPr>
           <w:tcPr/>
           <w:p>
@@ -6694,7 +6949,7 @@
         </w:tc>
         <w:tc>
           <w:tcPr>
-            <w:tcW w:w="2247" w:type="dxa"/>
+            <w:tcW w:w="2264" w:type="dxa"/>
           </w:tcPr>
           <w:tcPr/>
           <w:p>
@@ -6709,18 +6964,18 @@
         </w:tc>
         <w:tc>
           <w:tcPr>
-            <w:tcW w:w="1476" w:type="dxa"/>
-          </w:tcPr>
-          <w:tcPr/>
-          <w:p>
-            <w:pPr>
-              <w:pStyle w:val="Compact"/>
-            </w:pPr>
-          </w:p>
-        </w:tc>
-        <w:tc>
-          <w:tcPr>
-            <w:tcW w:w="2435" w:type="dxa"/>
+            <w:tcW w:w="1474" w:type="dxa"/>
+          </w:tcPr>
+          <w:tcPr/>
+          <w:p>
+            <w:pPr>
+              <w:pStyle w:val="Compact"/>
+            </w:pPr>
+          </w:p>
+        </w:tc>
+        <w:tc>
+          <w:tcPr>
+            <w:tcW w:w="2432" w:type="dxa"/>
           </w:tcPr>
           <w:tcPr/>
           <w:p>
@@ -6735,7 +6990,317 @@
         </w:tc>
         <w:tc>
           <w:tcPr>
-            <w:tcW w:w="1542" w:type="dxa"/>
+            <w:tcW w:w="1540" w:type="dxa"/>
+          </w:tcPr>
+          <w:tcPr/>
+          <w:p>
+            <w:pPr>
+              <w:pStyle w:val="Compact"/>
+            </w:pPr>
+          </w:p>
+        </w:tc>
+      </w:tr>
+      <w:tr>
+        <w:tc>
+          <w:tcPr>
+            <w:tcW w:w="2013" w:type="dxa"/>
+          </w:tcPr>
+          <w:tcPr/>
+          <w:p>
+            <w:pPr>
+              <w:pStyle w:val="Compact"/>
+              <w:jc w:val="left"/>
+            </w:pPr>
+            <w:r>
+              <w:t xml:space="preserve">A.0.5</w:t>
+            </w:r>
+          </w:p>
+        </w:tc>
+        <w:tc>
+          <w:tcPr>
+            <w:tcW w:w="5131" w:type="dxa"/>
+          </w:tcPr>
+          <w:tcPr/>
+          <w:p>
+            <w:pPr>
+              <w:pStyle w:val="Compact"/>
+              <w:jc w:val="left"/>
+            </w:pPr>
+            <w:r>
+              <w:t xml:space="preserve">Falls Anhang I:</w:t>
+            </w:r>
+            <w:r>
+              <w:t xml:space="preserve"> </w:t>
+            </w:r>
+            <w:r>
+              <w:rPr>
+                <w:bCs/>
+                <w:b/>
+              </w:rPr>
+              <w:t xml:space="preserve">Welcher konkrete Rechtsakt</w:t>
+            </w:r>
+            <w:r>
+              <w:t xml:space="preserve"> </w:t>
+            </w:r>
+            <w:r>
+              <w:t xml:space="preserve">aus Anhang I ist einschlägig, und steht er in</w:t>
+            </w:r>
+            <w:r>
+              <w:t xml:space="preserve"> </w:t>
+            </w:r>
+            <w:r>
+              <w:rPr>
+                <w:bCs/>
+                <w:b/>
+              </w:rPr>
+              <w:t xml:space="preserve">Abschnitt A oder Abschnitt B</w:t>
+            </w:r>
+            <w:r>
+              <w:t xml:space="preserve">? Solange das offen ist, keine Frist und keine Pflichtenliste als gesichert behandeln.</w:t>
+            </w:r>
+          </w:p>
+        </w:tc>
+        <w:tc>
+          <w:tcPr>
+            <w:tcW w:w="2264" w:type="dxa"/>
+          </w:tcPr>
+          <w:tcPr/>
+          <w:p>
+            <w:pPr>
+              <w:pStyle w:val="Compact"/>
+              <w:jc w:val="left"/>
+            </w:pPr>
+            <w:r>
+              <w:t xml:space="preserve">Anhang I, Art. 2 Abs. 2 n. F.</w:t>
+            </w:r>
+          </w:p>
+        </w:tc>
+        <w:tc>
+          <w:tcPr>
+            <w:tcW w:w="1474" w:type="dxa"/>
+          </w:tcPr>
+          <w:tcPr/>
+          <w:p>
+            <w:pPr>
+              <w:pStyle w:val="Compact"/>
+            </w:pPr>
+          </w:p>
+        </w:tc>
+        <w:tc>
+          <w:tcPr>
+            <w:tcW w:w="2432" w:type="dxa"/>
+          </w:tcPr>
+          <w:tcPr/>
+          <w:p>
+            <w:pPr>
+              <w:pStyle w:val="Compact"/>
+              <w:jc w:val="left"/>
+            </w:pPr>
+            <w:r>
+              <w:t xml:space="preserve">Rechtsaktbestimmung mit Nummer und Abschnitt</w:t>
+            </w:r>
+          </w:p>
+        </w:tc>
+        <w:tc>
+          <w:tcPr>
+            <w:tcW w:w="1540" w:type="dxa"/>
+          </w:tcPr>
+          <w:tcPr/>
+          <w:p>
+            <w:pPr>
+              <w:pStyle w:val="Compact"/>
+            </w:pPr>
+          </w:p>
+        </w:tc>
+      </w:tr>
+      <w:tr>
+        <w:tc>
+          <w:tcPr>
+            <w:tcW w:w="2013" w:type="dxa"/>
+          </w:tcPr>
+          <w:tcPr/>
+          <w:p>
+            <w:pPr>
+              <w:pStyle w:val="Compact"/>
+              <w:jc w:val="left"/>
+            </w:pPr>
+            <w:r>
+              <w:t xml:space="preserve">A.0.6</w:t>
+            </w:r>
+          </w:p>
+        </w:tc>
+        <w:tc>
+          <w:tcPr>
+            <w:tcW w:w="5131" w:type="dxa"/>
+          </w:tcPr>
+          <w:tcPr/>
+          <w:p>
+            <w:pPr>
+              <w:pStyle w:val="Compact"/>
+              <w:jc w:val="left"/>
+            </w:pPr>
+            <w:r>
+              <w:t xml:space="preserve">Falls Abschnitt B: Diese Checkliste ist</w:t>
+            </w:r>
+            <w:r>
+              <w:t xml:space="preserve"> </w:t>
+            </w:r>
+            <w:r>
+              <w:rPr>
+                <w:bCs/>
+                <w:b/>
+              </w:rPr>
+              <w:t xml:space="preserve">nicht</w:t>
+            </w:r>
+            <w:r>
+              <w:t xml:space="preserve"> </w:t>
+            </w:r>
+            <w:r>
+              <w:t xml:space="preserve">anwendbar. Maßgeblich sind Art. 6 Abs. 1, Art. 60a, Art. 102–112 KI-VO und das jeweilige Sektorrecht.</w:t>
+            </w:r>
+          </w:p>
+        </w:tc>
+        <w:tc>
+          <w:tcPr>
+            <w:tcW w:w="2264" w:type="dxa"/>
+          </w:tcPr>
+          <w:tcPr/>
+          <w:p>
+            <w:pPr>
+              <w:pStyle w:val="Compact"/>
+              <w:jc w:val="left"/>
+            </w:pPr>
+            <w:r>
+              <w:t xml:space="preserve">Art. 2 Abs. 2 n. F.</w:t>
+            </w:r>
+          </w:p>
+        </w:tc>
+        <w:tc>
+          <w:tcPr>
+            <w:tcW w:w="1474" w:type="dxa"/>
+          </w:tcPr>
+          <w:tcPr/>
+          <w:p>
+            <w:pPr>
+              <w:pStyle w:val="Compact"/>
+            </w:pPr>
+          </w:p>
+        </w:tc>
+        <w:tc>
+          <w:tcPr>
+            <w:tcW w:w="2432" w:type="dxa"/>
+          </w:tcPr>
+          <w:tcPr/>
+          <w:p>
+            <w:pPr>
+              <w:pStyle w:val="Compact"/>
+              <w:jc w:val="left"/>
+            </w:pPr>
+            <w:r>
+              <w:t xml:space="preserve">Zuordnung zum Sektorrecht</w:t>
+            </w:r>
+          </w:p>
+        </w:tc>
+        <w:tc>
+          <w:tcPr>
+            <w:tcW w:w="1540" w:type="dxa"/>
+          </w:tcPr>
+          <w:tcPr/>
+          <w:p>
+            <w:pPr>
+              <w:pStyle w:val="Compact"/>
+            </w:pPr>
+          </w:p>
+        </w:tc>
+      </w:tr>
+      <w:tr>
+        <w:tc>
+          <w:tcPr>
+            <w:tcW w:w="2013" w:type="dxa"/>
+          </w:tcPr>
+          <w:tcPr/>
+          <w:p>
+            <w:pPr>
+              <w:pStyle w:val="Compact"/>
+              <w:jc w:val="left"/>
+            </w:pPr>
+            <w:r>
+              <w:t xml:space="preserve">A.0.7</w:t>
+            </w:r>
+          </w:p>
+        </w:tc>
+        <w:tc>
+          <w:tcPr>
+            <w:tcW w:w="5131" w:type="dxa"/>
+          </w:tcPr>
+          <w:tcPr/>
+          <w:p>
+            <w:pPr>
+              <w:pStyle w:val="Compact"/>
+              <w:jc w:val="left"/>
+            </w:pPr>
+            <w:r>
+              <w:t xml:space="preserve">Ist die Einstufung</w:t>
+            </w:r>
+            <w:r>
+              <w:t xml:space="preserve"> </w:t>
+            </w:r>
+            <w:r>
+              <w:rPr>
+                <w:bCs/>
+                <w:b/>
+              </w:rPr>
+              <w:t xml:space="preserve">juristisch bestätigt</w:t>
+            </w:r>
+            <w:r>
+              <w:t xml:space="preserve">? Festhalten: Ja / Nein / offen, Datum, prüfende Person. Ohne Bestätigung gilt jede Frist als Planungsannahme.</w:t>
+            </w:r>
+          </w:p>
+        </w:tc>
+        <w:tc>
+          <w:tcPr>
+            <w:tcW w:w="2264" w:type="dxa"/>
+          </w:tcPr>
+          <w:tcPr/>
+          <w:p>
+            <w:pPr>
+              <w:pStyle w:val="Compact"/>
+              <w:jc w:val="left"/>
+            </w:pPr>
+            <w:r>
+              <w:t xml:space="preserve">(Nachweisführung)</w:t>
+            </w:r>
+          </w:p>
+        </w:tc>
+        <w:tc>
+          <w:tcPr>
+            <w:tcW w:w="1474" w:type="dxa"/>
+          </w:tcPr>
+          <w:tcPr/>
+          <w:p>
+            <w:pPr>
+              <w:pStyle w:val="Compact"/>
+            </w:pPr>
+          </w:p>
+        </w:tc>
+        <w:tc>
+          <w:tcPr>
+            <w:tcW w:w="2432" w:type="dxa"/>
+          </w:tcPr>
+          <w:tcPr/>
+          <w:p>
+            <w:pPr>
+              <w:pStyle w:val="Compact"/>
+              <w:jc w:val="left"/>
+            </w:pPr>
+            <w:r>
+              <w:t xml:space="preserve">Prüfvermerk mit Datum und Prüfer</w:t>
+            </w:r>
+          </w:p>
+        </w:tc>
+        <w:tc>
+          <w:tcPr>
+            <w:tcW w:w="1540" w:type="dxa"/>
           </w:tcPr>
           <w:tcPr/>
           <w:p>
@@ -6783,7 +7348,7 @@
           <w:bCs/>
           <w:b/>
         </w:rPr>
-        <w:t xml:space="preserve">Reichweite der Verschiebung — bitte beachten:</w:t>
+        <w:t xml:space="preserve">Reichweite der Verschiebung — Planungsannahme, nicht gesicherte Frist:</w:t>
       </w:r>
       <w:r>
         <w:t xml:space="preserve"> </w:t>
@@ -6821,12 +7386,28 @@
         <w:t xml:space="preserve"> </w:t>
       </w:r>
       <w:r>
-        <w:t xml:space="preserve">vom Wortlaut erfasst sind Kapitel III Abschnitt 5 (Art. 40–49: Konformitätsbewertung, Konformitätserklärung, CE, Registrierung), Kapitel IX (Art. 72, 73, 86) und Kapitel IV (Art. 50). Diese gelten seit dem 02.08.2026. In der Praxis greifen sie erst, sobald ein System nach dem verschobenen Art. 6 als hochriskant einzustufen ist — das ist eine vertretbare, aber nicht zwingende Auslegung. Die Angabe</w:t>
+        <w:t xml:space="preserve">vom Wortlaut erfasst sind Kapitel III Abschnitt 5 (Art. 40–49: Konformitätsbewertung, Konformitätserklärung, CE, Registrierung), Kapitel IX (Art. 72, 73, 86) und Kapitel IV (Art. 50). Diese gelten seit dem 02.08.2026. In der Praxis greifen sie erst, sobald ein System nach dem verschobenen Art. 6 als hochriskant einzustufen ist — das ist eine vertretbare, aber</w:t>
       </w:r>
       <w:r>
         <w:t xml:space="preserve"> </w:t>
       </w:r>
       <w:r>
+        <w:rPr>
+          <w:bCs/>
+          <w:b/>
+        </w:rPr>
+        <w:t xml:space="preserve">nicht zwingende und nicht anwaltlich bestätigte</w:t>
+      </w:r>
+      <w:r>
+        <w:t xml:space="preserve"> </w:t>
+      </w:r>
+      <w:r>
+        <w:t xml:space="preserve">Auslegung. Die Angabe</w:t>
+      </w:r>
+      <w:r>
+        <w:t xml:space="preserve"> </w:t>
+      </w:r>
+      <w:r>
         <w:t xml:space="preserve">“</w:t>
       </w:r>
       <w:r>
@@ -6839,7 +7420,7 @@
         <w:t xml:space="preserve"> </w:t>
       </w:r>
       <w:r>
-        <w:t xml:space="preserve">in den folgenden Tabellen steht unter diesem Vorbehalt; wer sich darauf stützt, sollte die Erwägung dokumentieren.</w:t>
+        <w:t xml:space="preserve">in den folgenden Tabellen steht unter diesem Vorbehalt. Vor Inbetriebnahme eines konkreten Systems ist die Frage zu prüfen; halten Sie Ergebnis, Datum und Prüfer fest.</w:t>
       </w:r>
     </w:p>
     <w:p>
@@ -6851,13 +7432,13 @@
           <w:bCs/>
           <w:b/>
         </w:rPr>
-        <w:t xml:space="preserve">Anhang I Abschnitt A oder B?</w:t>
+        <w:t xml:space="preserve">Anhang I Abschnitt A oder B? Zuerst klären — dann weiterarbeiten.</w:t>
       </w:r>
       <w:r>
         <w:t xml:space="preserve"> </w:t>
       </w:r>
       <w:r>
-        <w:t xml:space="preserve">Diese Unterscheidung entscheidet, ob Kapitel III überhaupt gilt. Für Produkte nach</w:t>
+        <w:t xml:space="preserve">Bestimmen Sie den konkreten Rechtsakt aus Anhang I und den Abschnitt, in dem er gelistet ist.</w:t>
       </w:r>
       <w:r>
         <w:t xml:space="preserve"> </w:t>
@@ -6867,13 +7448,29 @@
           <w:bCs/>
           <w:b/>
         </w:rPr>
-        <w:t xml:space="preserve">Anhang I Abschnitt B</w:t>
+        <w:t xml:space="preserve">Abschnitt A</w:t>
       </w:r>
       <w:r>
         <w:t xml:space="preserve"> </w:t>
       </w:r>
       <w:r>
-        <w:t xml:space="preserve">— Zivilluftfahrt, Kraftfahrzeuge, Schiffsausrüstung, Eisenbahn und seit Juli 2026 die</w:t>
+        <w:t xml:space="preserve">(u. a. Spielzeug, Aufzüge, ATEX, Funkanlagen, Druckgeräte, Seilbahnen, PSA, Gasverbrennungsgeräte, Medizinprodukte, In-vitro-Diagnostika): volles Kapitel III ab 02.08.2028 — vorbehaltlich delegierter Rechtsakte nach Art. 2 Abs. 13 KI-VO n. F. (bis 02.08.2027).</w:t>
+      </w:r>
+      <w:r>
+        <w:t xml:space="preserve"> </w:t>
+      </w:r>
+      <w:r>
+        <w:rPr>
+          <w:bCs/>
+          <w:b/>
+        </w:rPr>
+        <w:t xml:space="preserve">Abschnitt B</w:t>
+      </w:r>
+      <w:r>
+        <w:t xml:space="preserve"> </w:t>
+      </w:r>
+      <w:r>
+        <w:t xml:space="preserve">(Zivilluftfahrt, Kraftfahrzeuge, Schiffsausrüstung, Eisenbahn und seit Juli 2026 die</w:t>
       </w:r>
       <w:r>
         <w:t xml:space="preserve"> </w:t>
@@ -6886,10 +7483,7 @@
         <w:t xml:space="preserve">Maschinenverordnung (EU) 2023/1230</w:t>
       </w:r>
       <w:r>
-        <w:t xml:space="preserve"> </w:t>
-      </w:r>
-      <w:r>
-        <w:t xml:space="preserve">— gelten nach Art. 2 Abs. 2 KI-VO n. F.</w:t>
+        <w:t xml:space="preserve">): Es gelten nach Art. 2 Abs. 2 KI-VO n. F.</w:t>
       </w:r>
       <w:r>
         <w:t xml:space="preserve"> </w:t>
@@ -6902,7 +7496,51 @@
         <w:t xml:space="preserve">nur Art. 6 Abs. 1, Art. 60a und Art. 102–112</w:t>
       </w:r>
       <w:r>
-        <w:t xml:space="preserve">. Die Checklisten A und B sind für solche Systeme</w:t>
+        <w:t xml:space="preserve"> </w:t>
+      </w:r>
+      <w:r>
+        <w:t xml:space="preserve">— Art. 57, 58 und 59 zusätzlich, soweit das Sektorrecht die Hochrisiko-Anforderungen übernommen hat.</w:t>
+      </w:r>
+      <w:r>
+        <w:t xml:space="preserve"> </w:t>
+      </w:r>
+      <w:r>
+        <w:rPr>
+          <w:bCs/>
+          <w:b/>
+        </w:rPr>
+        <w:t xml:space="preserve">Achtung:</w:t>
+      </w:r>
+      <w:r>
+        <w:t xml:space="preserve"> </w:t>
+      </w:r>
+      <w:r>
+        <w:t xml:space="preserve">“</w:t>
+      </w:r>
+      <w:r>
+        <w:t xml:space="preserve">Kapitel III gilt nicht</w:t>
+      </w:r>
+      <w:r>
+        <w:t xml:space="preserve">”</w:t>
+      </w:r>
+      <w:r>
+        <w:t xml:space="preserve"> </w:t>
+      </w:r>
+      <w:r>
+        <w:t xml:space="preserve">wäre zu grob —</w:t>
+      </w:r>
+      <w:r>
+        <w:t xml:space="preserve"> </w:t>
+      </w:r>
+      <w:r>
+        <w:rPr>
+          <w:bCs/>
+          <w:b/>
+        </w:rPr>
+        <w:t xml:space="preserve">Art. 6 Abs. 1 gilt weiter</w:t>
+      </w:r>
+      <w:r>
+        <w:t xml:space="preserve">, das System bleibt also ein Hochrisiko-KI-System im Sinne der Verordnung. Die Checklisten A und B sind auf die Pflichtenteile für solche Systeme</w:t>
       </w:r>
       <w:r>
         <w:t xml:space="preserve"> </w:t>
@@ -6919,6 +7557,22 @@
       </w:r>
       <w:r>
         <w:t xml:space="preserve">anzuwenden; maßgeblich ist das jeweilige Sektorrecht (bei Maschinen: Anhang III der VO (EU) 2023/1230, delegierter Rechtsakt mit Geltung ab 02.08.2028).</w:t>
+      </w:r>
+      <w:r>
+        <w:t xml:space="preserve"> </w:t>
+      </w:r>
+      <w:r>
+        <w:rPr>
+          <w:bCs/>
+          <w:b/>
+        </w:rPr>
+        <w:t xml:space="preserve">Noch offen:</w:t>
+      </w:r>
+      <w:r>
+        <w:t xml:space="preserve"> </w:t>
+      </w:r>
+      <w:r>
+        <w:t xml:space="preserve">Solange der Abschnitt nicht bestimmt ist, dürfen weder eine Frist noch eine Pflichtenliste als gesichert behandelt werden.</w:t>
       </w:r>
     </w:p>
     <w:bookmarkEnd w:id="30"/>
@@ -10976,13 +11630,13 @@
         <w:jc w:val="start"/>
       </w:tblPr>
       <w:tblGrid>
-        <w:gridCol w:w="1804"/>
-        <w:gridCol w:w="4306"/>
-        <w:gridCol w:w="1937"/>
-        <w:gridCol w:w="1927"/>
-        <w:gridCol w:w="1321"/>
-        <w:gridCol w:w="2179"/>
-        <w:gridCol w:w="1380"/>
+        <w:gridCol w:w="1619"/>
+        <w:gridCol w:w="4679"/>
+        <w:gridCol w:w="1971"/>
+        <w:gridCol w:w="1747"/>
+        <w:gridCol w:w="1186"/>
+        <w:gridCol w:w="2414"/>
+        <w:gridCol w:w="1238"/>
       </w:tblGrid>
       <w:tr>
         <w:trPr>
@@ -10993,7 +11647,7 @@
         <w:tc>
           <w:tcPr>
             <w:shd w:val="clear" w:color="auto" w:fill="DCE4F2"/>
-            <w:tcW w:w="1804" w:type="dxa"/>
+            <w:tcW w:w="1619" w:type="dxa"/>
           </w:tcPr>
           <w:tcPr/>
           <w:p>
@@ -11009,7 +11663,7 @@
         <w:tc>
           <w:tcPr>
             <w:shd w:val="clear" w:color="auto" w:fill="DCE4F2"/>
-            <w:tcW w:w="4306" w:type="dxa"/>
+            <w:tcW w:w="4679" w:type="dxa"/>
           </w:tcPr>
           <w:tcPr/>
           <w:p>
@@ -11025,7 +11679,7 @@
         <w:tc>
           <w:tcPr>
             <w:shd w:val="clear" w:color="auto" w:fill="DCE4F2"/>
-            <w:tcW w:w="1937" w:type="dxa"/>
+            <w:tcW w:w="1971" w:type="dxa"/>
           </w:tcPr>
           <w:tcPr/>
           <w:p>
@@ -11041,7 +11695,7 @@
         <w:tc>
           <w:tcPr>
             <w:shd w:val="clear" w:color="auto" w:fill="DCE4F2"/>
-            <w:tcW w:w="1927" w:type="dxa"/>
+            <w:tcW w:w="1747" w:type="dxa"/>
           </w:tcPr>
           <w:tcPr/>
           <w:p>
@@ -11057,7 +11711,7 @@
         <w:tc>
           <w:tcPr>
             <w:shd w:val="clear" w:color="auto" w:fill="DCE4F2"/>
-            <w:tcW w:w="1321" w:type="dxa"/>
+            <w:tcW w:w="1186" w:type="dxa"/>
           </w:tcPr>
           <w:tcPr/>
           <w:p>
@@ -11073,7 +11727,7 @@
         <w:tc>
           <w:tcPr>
             <w:shd w:val="clear" w:color="auto" w:fill="DCE4F2"/>
-            <w:tcW w:w="2179" w:type="dxa"/>
+            <w:tcW w:w="2414" w:type="dxa"/>
           </w:tcPr>
           <w:tcPr/>
           <w:p>
@@ -11089,7 +11743,7 @@
         <w:tc>
           <w:tcPr>
             <w:shd w:val="clear" w:color="auto" w:fill="DCE4F2"/>
-            <w:tcW w:w="1380" w:type="dxa"/>
+            <w:tcW w:w="1238" w:type="dxa"/>
           </w:tcPr>
           <w:tcPr/>
           <w:p>
@@ -11106,7 +11760,7 @@
       <w:tr>
         <w:tc>
           <w:tcPr>
-            <w:tcW w:w="1804" w:type="dxa"/>
+            <w:tcW w:w="1619" w:type="dxa"/>
           </w:tcPr>
           <w:tcPr/>
           <w:p>
@@ -11121,7 +11775,7 @@
         </w:tc>
         <w:tc>
           <w:tcPr>
-            <w:tcW w:w="4306" w:type="dxa"/>
+            <w:tcW w:w="4679" w:type="dxa"/>
           </w:tcPr>
           <w:tcPr/>
           <w:p>
@@ -11146,7 +11800,7 @@
         </w:tc>
         <w:tc>
           <w:tcPr>
-            <w:tcW w:w="1937" w:type="dxa"/>
+            <w:tcW w:w="1971" w:type="dxa"/>
           </w:tcPr>
           <w:tcPr/>
           <w:p>
@@ -11161,7 +11815,7 @@
         </w:tc>
         <w:tc>
           <w:tcPr>
-            <w:tcW w:w="1927" w:type="dxa"/>
+            <w:tcW w:w="1747" w:type="dxa"/>
           </w:tcPr>
           <w:tcPr/>
           <w:p>
@@ -11176,18 +11830,18 @@
         </w:tc>
         <w:tc>
           <w:tcPr>
-            <w:tcW w:w="1321" w:type="dxa"/>
-          </w:tcPr>
-          <w:tcPr/>
-          <w:p>
-            <w:pPr>
-              <w:pStyle w:val="Compact"/>
-            </w:pPr>
-          </w:p>
-        </w:tc>
-        <w:tc>
-          <w:tcPr>
-            <w:tcW w:w="2179" w:type="dxa"/>
+            <w:tcW w:w="1186" w:type="dxa"/>
+          </w:tcPr>
+          <w:tcPr/>
+          <w:p>
+            <w:pPr>
+              <w:pStyle w:val="Compact"/>
+            </w:pPr>
+          </w:p>
+        </w:tc>
+        <w:tc>
+          <w:tcPr>
+            <w:tcW w:w="2414" w:type="dxa"/>
           </w:tcPr>
           <w:tcPr/>
           <w:p>
@@ -11202,7 +11856,7 @@
         </w:tc>
         <w:tc>
           <w:tcPr>
-            <w:tcW w:w="1380" w:type="dxa"/>
+            <w:tcW w:w="1238" w:type="dxa"/>
           </w:tcPr>
           <w:tcPr/>
           <w:p>
@@ -11215,7 +11869,7 @@
       <w:tr>
         <w:tc>
           <w:tcPr>
-            <w:tcW w:w="1804" w:type="dxa"/>
+            <w:tcW w:w="1619" w:type="dxa"/>
           </w:tcPr>
           <w:tcPr/>
           <w:p>
@@ -11230,7 +11884,7 @@
         </w:tc>
         <w:tc>
           <w:tcPr>
-            <w:tcW w:w="4306" w:type="dxa"/>
+            <w:tcW w:w="4679" w:type="dxa"/>
           </w:tcPr>
           <w:tcPr/>
           <w:p>
@@ -11271,7 +11925,7 @@
         </w:tc>
         <w:tc>
           <w:tcPr>
-            <w:tcW w:w="1937" w:type="dxa"/>
+            <w:tcW w:w="1971" w:type="dxa"/>
           </w:tcPr>
           <w:tcPr/>
           <w:p>
@@ -11286,7 +11940,7 @@
         </w:tc>
         <w:tc>
           <w:tcPr>
-            <w:tcW w:w="1927" w:type="dxa"/>
+            <w:tcW w:w="1747" w:type="dxa"/>
           </w:tcPr>
           <w:tcPr/>
           <w:p>
@@ -11301,18 +11955,18 @@
         </w:tc>
         <w:tc>
           <w:tcPr>
-            <w:tcW w:w="1321" w:type="dxa"/>
-          </w:tcPr>
-          <w:tcPr/>
-          <w:p>
-            <w:pPr>
-              <w:pStyle w:val="Compact"/>
-            </w:pPr>
-          </w:p>
-        </w:tc>
-        <w:tc>
-          <w:tcPr>
-            <w:tcW w:w="2179" w:type="dxa"/>
+            <w:tcW w:w="1186" w:type="dxa"/>
+          </w:tcPr>
+          <w:tcPr/>
+          <w:p>
+            <w:pPr>
+              <w:pStyle w:val="Compact"/>
+            </w:pPr>
+          </w:p>
+        </w:tc>
+        <w:tc>
+          <w:tcPr>
+            <w:tcW w:w="2414" w:type="dxa"/>
           </w:tcPr>
           <w:tcPr/>
           <w:p>
@@ -11327,7 +11981,7 @@
         </w:tc>
         <w:tc>
           <w:tcPr>
-            <w:tcW w:w="1380" w:type="dxa"/>
+            <w:tcW w:w="1238" w:type="dxa"/>
           </w:tcPr>
           <w:tcPr/>
           <w:p>
@@ -11340,7 +11994,7 @@
       <w:tr>
         <w:tc>
           <w:tcPr>
-            <w:tcW w:w="1804" w:type="dxa"/>
+            <w:tcW w:w="1619" w:type="dxa"/>
           </w:tcPr>
           <w:tcPr/>
           <w:p>
@@ -11355,7 +12009,7 @@
         </w:tc>
         <w:tc>
           <w:tcPr>
-            <w:tcW w:w="4306" w:type="dxa"/>
+            <w:tcW w:w="4679" w:type="dxa"/>
           </w:tcPr>
           <w:tcPr/>
           <w:p>
@@ -11386,7 +12040,7 @@
         </w:tc>
         <w:tc>
           <w:tcPr>
-            <w:tcW w:w="1937" w:type="dxa"/>
+            <w:tcW w:w="1971" w:type="dxa"/>
           </w:tcPr>
           <w:tcPr/>
           <w:p>
@@ -11401,7 +12055,7 @@
         </w:tc>
         <w:tc>
           <w:tcPr>
-            <w:tcW w:w="1927" w:type="dxa"/>
+            <w:tcW w:w="1747" w:type="dxa"/>
           </w:tcPr>
           <w:tcPr/>
           <w:p>
@@ -11416,18 +12070,18 @@
         </w:tc>
         <w:tc>
           <w:tcPr>
-            <w:tcW w:w="1321" w:type="dxa"/>
-          </w:tcPr>
-          <w:tcPr/>
-          <w:p>
-            <w:pPr>
-              <w:pStyle w:val="Compact"/>
-            </w:pPr>
-          </w:p>
-        </w:tc>
-        <w:tc>
-          <w:tcPr>
-            <w:tcW w:w="2179" w:type="dxa"/>
+            <w:tcW w:w="1186" w:type="dxa"/>
+          </w:tcPr>
+          <w:tcPr/>
+          <w:p>
+            <w:pPr>
+              <w:pStyle w:val="Compact"/>
+            </w:pPr>
+          </w:p>
+        </w:tc>
+        <w:tc>
+          <w:tcPr>
+            <w:tcW w:w="2414" w:type="dxa"/>
           </w:tcPr>
           <w:tcPr/>
           <w:p>
@@ -11442,7 +12096,7 @@
         </w:tc>
         <w:tc>
           <w:tcPr>
-            <w:tcW w:w="1380" w:type="dxa"/>
+            <w:tcW w:w="1238" w:type="dxa"/>
           </w:tcPr>
           <w:tcPr/>
           <w:p>
@@ -11455,7 +12109,7 @@
       <w:tr>
         <w:tc>
           <w:tcPr>
-            <w:tcW w:w="1804" w:type="dxa"/>
+            <w:tcW w:w="1619" w:type="dxa"/>
           </w:tcPr>
           <w:tcPr/>
           <w:p>
@@ -11470,7 +12124,7 @@
         </w:tc>
         <w:tc>
           <w:tcPr>
-            <w:tcW w:w="4306" w:type="dxa"/>
+            <w:tcW w:w="4679" w:type="dxa"/>
           </w:tcPr>
           <w:tcPr/>
           <w:p>
@@ -11495,7 +12149,7 @@
         </w:tc>
         <w:tc>
           <w:tcPr>
-            <w:tcW w:w="1937" w:type="dxa"/>
+            <w:tcW w:w="1971" w:type="dxa"/>
           </w:tcPr>
           <w:tcPr/>
           <w:p>
@@ -11510,7 +12164,7 @@
         </w:tc>
         <w:tc>
           <w:tcPr>
-            <w:tcW w:w="1927" w:type="dxa"/>
+            <w:tcW w:w="1747" w:type="dxa"/>
           </w:tcPr>
           <w:tcPr/>
           <w:p>
@@ -11525,18 +12179,18 @@
         </w:tc>
         <w:tc>
           <w:tcPr>
-            <w:tcW w:w="1321" w:type="dxa"/>
-          </w:tcPr>
-          <w:tcPr/>
-          <w:p>
-            <w:pPr>
-              <w:pStyle w:val="Compact"/>
-            </w:pPr>
-          </w:p>
-        </w:tc>
-        <w:tc>
-          <w:tcPr>
-            <w:tcW w:w="2179" w:type="dxa"/>
+            <w:tcW w:w="1186" w:type="dxa"/>
+          </w:tcPr>
+          <w:tcPr/>
+          <w:p>
+            <w:pPr>
+              <w:pStyle w:val="Compact"/>
+            </w:pPr>
+          </w:p>
+        </w:tc>
+        <w:tc>
+          <w:tcPr>
+            <w:tcW w:w="2414" w:type="dxa"/>
           </w:tcPr>
           <w:tcPr/>
           <w:p>
@@ -11551,7 +12205,7 @@
         </w:tc>
         <w:tc>
           <w:tcPr>
-            <w:tcW w:w="1380" w:type="dxa"/>
+            <w:tcW w:w="1238" w:type="dxa"/>
           </w:tcPr>
           <w:tcPr/>
           <w:p>
@@ -11564,7 +12218,7 @@
       <w:tr>
         <w:tc>
           <w:tcPr>
-            <w:tcW w:w="1804" w:type="dxa"/>
+            <w:tcW w:w="1619" w:type="dxa"/>
           </w:tcPr>
           <w:tcPr/>
           <w:p>
@@ -11579,7 +12233,7 @@
         </w:tc>
         <w:tc>
           <w:tcPr>
-            <w:tcW w:w="4306" w:type="dxa"/>
+            <w:tcW w:w="4679" w:type="dxa"/>
           </w:tcPr>
           <w:tcPr/>
           <w:p>
@@ -11620,7 +12274,7 @@
         </w:tc>
         <w:tc>
           <w:tcPr>
-            <w:tcW w:w="1937" w:type="dxa"/>
+            <w:tcW w:w="1971" w:type="dxa"/>
           </w:tcPr>
           <w:tcPr/>
           <w:p>
@@ -11635,7 +12289,7 @@
         </w:tc>
         <w:tc>
           <w:tcPr>
-            <w:tcW w:w="1927" w:type="dxa"/>
+            <w:tcW w:w="1747" w:type="dxa"/>
           </w:tcPr>
           <w:tcPr/>
           <w:p>
@@ -11650,18 +12304,18 @@
         </w:tc>
         <w:tc>
           <w:tcPr>
-            <w:tcW w:w="1321" w:type="dxa"/>
-          </w:tcPr>
-          <w:tcPr/>
-          <w:p>
-            <w:pPr>
-              <w:pStyle w:val="Compact"/>
-            </w:pPr>
-          </w:p>
-        </w:tc>
-        <w:tc>
-          <w:tcPr>
-            <w:tcW w:w="2179" w:type="dxa"/>
+            <w:tcW w:w="1186" w:type="dxa"/>
+          </w:tcPr>
+          <w:tcPr/>
+          <w:p>
+            <w:pPr>
+              <w:pStyle w:val="Compact"/>
+            </w:pPr>
+          </w:p>
+        </w:tc>
+        <w:tc>
+          <w:tcPr>
+            <w:tcW w:w="2414" w:type="dxa"/>
           </w:tcPr>
           <w:tcPr/>
           <w:p>
@@ -11676,7 +12330,7 @@
         </w:tc>
         <w:tc>
           <w:tcPr>
-            <w:tcW w:w="1380" w:type="dxa"/>
+            <w:tcW w:w="1238" w:type="dxa"/>
           </w:tcPr>
           <w:tcPr/>
           <w:p>
@@ -11689,7 +12343,7 @@
       <w:tr>
         <w:tc>
           <w:tcPr>
-            <w:tcW w:w="1804" w:type="dxa"/>
+            <w:tcW w:w="1619" w:type="dxa"/>
           </w:tcPr>
           <w:tcPr/>
           <w:p>
@@ -11704,7 +12358,7 @@
         </w:tc>
         <w:tc>
           <w:tcPr>
-            <w:tcW w:w="4306" w:type="dxa"/>
+            <w:tcW w:w="4679" w:type="dxa"/>
           </w:tcPr>
           <w:tcPr/>
           <w:p>
@@ -11723,7 +12377,52 @@
               <w:t xml:space="preserve"> </w:t>
             </w:r>
             <w:r>
-              <w:t xml:space="preserve">Bei Verarbeitung besonderer Kategorien personenbezogener Daten zur Erkennung und Korrektur von Verzerrungen: sämtliche Bedingungen des Art. 4a Abs. 1 lit. a–f einhalten (Art. 10 Abs. 5 a. F. ist gestrichen). Aus der Erlaubnis folgt</w:t>
+              <w:t xml:space="preserve">Verarbeitung besonderer Kategorien personenbezogener Daten zur Erkennung und Korrektur von Verzerrungen. Für</w:t>
+            </w:r>
+            <w:r>
+              <w:t xml:space="preserve"> </w:t>
+            </w:r>
+            <w:r>
+              <w:rPr>
+                <w:bCs/>
+                <w:b/>
+              </w:rPr>
+              <w:t xml:space="preserve">Betreiber</w:t>
+            </w:r>
+            <w:r>
+              <w:t xml:space="preserve"> </w:t>
+            </w:r>
+            <w:r>
+              <w:t xml:space="preserve">gilt</w:t>
+            </w:r>
+            <w:r>
+              <w:t xml:space="preserve"> </w:t>
+            </w:r>
+            <w:r>
+              <w:rPr>
+                <w:bCs/>
+                <w:b/>
+              </w:rPr>
+              <w:t xml:space="preserve">Art. 4a Abs. 2</w:t>
+            </w:r>
+            <w:r>
+              <w:t xml:space="preserve">: zusätzlich zu sämtlichen Bedingungen des Abs. 1 lit. a–f muss die Verarbeitung</w:t>
+            </w:r>
+            <w:r>
+              <w:t xml:space="preserve"> </w:t>
+            </w:r>
+            <w:r>
+              <w:rPr>
+                <w:bCs/>
+                <w:b/>
+              </w:rPr>
+              <w:t xml:space="preserve">unbedingt erforderlich</w:t>
+            </w:r>
+            <w:r>
+              <w:t xml:space="preserve"> </w:t>
+            </w:r>
+            <w:r>
+              <w:t xml:space="preserve">sein im Hinblick auf Verzerrungen, die Gesundheit und Sicherheit beeinträchtigen, negative Auswirkungen auf Grundrechte haben oder zu unionsrechtlich verbotener Diskriminierung führen können. Aus der Erlaubnis folgt</w:t>
             </w:r>
             <w:r>
               <w:t xml:space="preserve"> </w:t>
@@ -11745,63 +12444,217 @@
         </w:tc>
         <w:tc>
           <w:tcPr>
-            <w:tcW w:w="1937" w:type="dxa"/>
-          </w:tcPr>
-          <w:tcPr/>
-          <w:p>
-            <w:pPr>
-              <w:pStyle w:val="Compact"/>
-              <w:jc w:val="left"/>
-            </w:pPr>
-            <w:r>
-              <w:t xml:space="preserve">Art. 4a KI-VO n. F.</w:t>
-            </w:r>
-          </w:p>
-        </w:tc>
-        <w:tc>
-          <w:tcPr>
-            <w:tcW w:w="1927" w:type="dxa"/>
-          </w:tcPr>
-          <w:tcPr/>
-          <w:p>
-            <w:pPr>
-              <w:pStyle w:val="Compact"/>
-              <w:jc w:val="left"/>
-            </w:pPr>
-            <w:r>
-              <w:t xml:space="preserve">gilt ab 02.08.2026</w:t>
-            </w:r>
-          </w:p>
-        </w:tc>
-        <w:tc>
-          <w:tcPr>
-            <w:tcW w:w="1321" w:type="dxa"/>
-          </w:tcPr>
-          <w:tcPr/>
-          <w:p>
-            <w:pPr>
-              <w:pStyle w:val="Compact"/>
-            </w:pPr>
-          </w:p>
-        </w:tc>
-        <w:tc>
-          <w:tcPr>
-            <w:tcW w:w="2179" w:type="dxa"/>
-          </w:tcPr>
-          <w:tcPr/>
-          <w:p>
-            <w:pPr>
-              <w:pStyle w:val="Compact"/>
-              <w:jc w:val="left"/>
-            </w:pPr>
-            <w:r>
-              <w:t xml:space="preserve">Erforderlichkeitsprüfung, Schutzvorkehrungen</w:t>
-            </w:r>
-          </w:p>
-        </w:tc>
-        <w:tc>
-          <w:tcPr>
-            <w:tcW w:w="1380" w:type="dxa"/>
+            <w:tcW w:w="1971" w:type="dxa"/>
+          </w:tcPr>
+          <w:tcPr/>
+          <w:p>
+            <w:pPr>
+              <w:pStyle w:val="Compact"/>
+              <w:jc w:val="left"/>
+            </w:pPr>
+            <w:r>
+              <w:t xml:space="preserve">Art. 4a Abs. 2 i. V. m. Abs. 1 KI-VO n. F.</w:t>
+            </w:r>
+          </w:p>
+        </w:tc>
+        <w:tc>
+          <w:tcPr>
+            <w:tcW w:w="1747" w:type="dxa"/>
+          </w:tcPr>
+          <w:tcPr/>
+          <w:p>
+            <w:pPr>
+              <w:pStyle w:val="Compact"/>
+              <w:jc w:val="left"/>
+            </w:pPr>
+            <w:r>
+              <w:t xml:space="preserve">gilt seit 27.07.2026</w:t>
+            </w:r>
+          </w:p>
+        </w:tc>
+        <w:tc>
+          <w:tcPr>
+            <w:tcW w:w="1186" w:type="dxa"/>
+          </w:tcPr>
+          <w:tcPr/>
+          <w:p>
+            <w:pPr>
+              <w:pStyle w:val="Compact"/>
+            </w:pPr>
+          </w:p>
+        </w:tc>
+        <w:tc>
+          <w:tcPr>
+            <w:tcW w:w="2414" w:type="dxa"/>
+          </w:tcPr>
+          <w:tcPr/>
+          <w:p>
+            <w:pPr>
+              <w:pStyle w:val="Compact"/>
+              <w:jc w:val="left"/>
+            </w:pPr>
+            <w:r>
+              <w:t xml:space="preserve">Erforderlichkeitsprüfung, Schutzvorkehrungen, Verarbeitungsverzeichnis-Eintrag mit Begründung (Abs. 1 lit. f)</w:t>
+            </w:r>
+          </w:p>
+        </w:tc>
+        <w:tc>
+          <w:tcPr>
+            <w:tcW w:w="1238" w:type="dxa"/>
+          </w:tcPr>
+          <w:tcPr/>
+          <w:p>
+            <w:pPr>
+              <w:pStyle w:val="Compact"/>
+            </w:pPr>
+          </w:p>
+        </w:tc>
+      </w:tr>
+      <w:tr>
+        <w:tc>
+          <w:tcPr>
+            <w:tcW w:w="1619" w:type="dxa"/>
+          </w:tcPr>
+          <w:tcPr/>
+          <w:p>
+            <w:pPr>
+              <w:pStyle w:val="Compact"/>
+              <w:jc w:val="left"/>
+            </w:pPr>
+            <w:r>
+              <w:t xml:space="preserve">A.7.7</w:t>
+            </w:r>
+          </w:p>
+        </w:tc>
+        <w:tc>
+          <w:tcPr>
+            <w:tcW w:w="4679" w:type="dxa"/>
+          </w:tcPr>
+          <w:tcPr/>
+          <w:p>
+            <w:pPr>
+              <w:pStyle w:val="Compact"/>
+              <w:jc w:val="left"/>
+            </w:pPr>
+            <w:r>
+              <w:rPr>
+                <w:bCs/>
+                <w:b/>
+              </w:rPr>
+              <w:t xml:space="preserve">Abgrenzung:</w:t>
+            </w:r>
+            <w:r>
+              <w:t xml:space="preserve"> </w:t>
+            </w:r>
+            <w:r>
+              <w:t xml:space="preserve">Art. 4a ist</w:t>
+            </w:r>
+            <w:r>
+              <w:t xml:space="preserve"> </w:t>
+            </w:r>
+            <w:r>
+              <w:rPr>
+                <w:bCs/>
+                <w:b/>
+              </w:rPr>
+              <w:t xml:space="preserve">keine allgemeine Rechtsgrundlage</w:t>
+            </w:r>
+            <w:r>
+              <w:t xml:space="preserve"> </w:t>
+            </w:r>
+            <w:r>
+              <w:t xml:space="preserve">und</w:t>
+            </w:r>
+            <w:r>
+              <w:t xml:space="preserve"> </w:t>
+            </w:r>
+            <w:r>
+              <w:rPr>
+                <w:bCs/>
+                <w:b/>
+              </w:rPr>
+              <w:t xml:space="preserve">ersetzt keine datenschutzrechtliche Prüfung</w:t>
+            </w:r>
+            <w:r>
+              <w:t xml:space="preserve">. Die Bedingungen gelten ausdrücklich</w:t>
+            </w:r>
+            <w:r>
+              <w:t xml:space="preserve"> </w:t>
+            </w:r>
+            <w:r>
+              <w:rPr>
+                <w:iCs/>
+                <w:i/>
+              </w:rPr>
+              <w:t xml:space="preserve">zusätzlich</w:t>
+            </w:r>
+            <w:r>
+              <w:t xml:space="preserve"> </w:t>
+            </w:r>
+            <w:r>
+              <w:t xml:space="preserve">zu DSGVO, VO (EU) 2018/1725 und RL (EU) 2016/680. Verantwortlichkeit, Zweckbindung, Betroffenenrechte und ggf. DSFA gesondert prüfen.</w:t>
+            </w:r>
+          </w:p>
+        </w:tc>
+        <w:tc>
+          <w:tcPr>
+            <w:tcW w:w="1971" w:type="dxa"/>
+          </w:tcPr>
+          <w:tcPr/>
+          <w:p>
+            <w:pPr>
+              <w:pStyle w:val="Compact"/>
+              <w:jc w:val="left"/>
+            </w:pPr>
+            <w:r>
+              <w:t xml:space="preserve">Art. 4a Abs. 1 UAbs. 1 KI-VO n. F.; Art. 9 DSGVO</w:t>
+            </w:r>
+          </w:p>
+        </w:tc>
+        <w:tc>
+          <w:tcPr>
+            <w:tcW w:w="1747" w:type="dxa"/>
+          </w:tcPr>
+          <w:tcPr/>
+          <w:p>
+            <w:pPr>
+              <w:pStyle w:val="Compact"/>
+              <w:jc w:val="left"/>
+            </w:pPr>
+            <w:r>
+              <w:t xml:space="preserve">gilt seit 27.07.2026</w:t>
+            </w:r>
+          </w:p>
+        </w:tc>
+        <w:tc>
+          <w:tcPr>
+            <w:tcW w:w="1186" w:type="dxa"/>
+          </w:tcPr>
+          <w:tcPr/>
+          <w:p>
+            <w:pPr>
+              <w:pStyle w:val="Compact"/>
+            </w:pPr>
+          </w:p>
+        </w:tc>
+        <w:tc>
+          <w:tcPr>
+            <w:tcW w:w="2414" w:type="dxa"/>
+          </w:tcPr>
+          <w:tcPr/>
+          <w:p>
+            <w:pPr>
+              <w:pStyle w:val="Compact"/>
+              <w:jc w:val="left"/>
+            </w:pPr>
+            <w:r>
+              <w:t xml:space="preserve">Datenschutzrechtliche Bewertung</w:t>
+            </w:r>
+          </w:p>
+        </w:tc>
+        <w:tc>
+          <w:tcPr>
+            <w:tcW w:w="1238" w:type="dxa"/>
           </w:tcPr>
           <w:tcPr/>
           <w:p>
@@ -13652,12 +14505,12 @@
         <w:jc w:val="start"/>
       </w:tblPr>
       <w:tblGrid>
-        <w:gridCol w:w="2195"/>
-        <w:gridCol w:w="4522"/>
-        <w:gridCol w:w="2423"/>
-        <w:gridCol w:w="1599"/>
-        <w:gridCol w:w="2445"/>
-        <w:gridCol w:w="1670"/>
+        <w:gridCol w:w="2031"/>
+        <w:gridCol w:w="4682"/>
+        <w:gridCol w:w="2695"/>
+        <w:gridCol w:w="1480"/>
+        <w:gridCol w:w="2421"/>
+        <w:gridCol w:w="1545"/>
       </w:tblGrid>
       <w:tr>
         <w:trPr>
@@ -13668,7 +14521,7 @@
         <w:tc>
           <w:tcPr>
             <w:shd w:val="clear" w:color="auto" w:fill="DCE4F2"/>
-            <w:tcW w:w="2195" w:type="dxa"/>
+            <w:tcW w:w="2031" w:type="dxa"/>
           </w:tcPr>
           <w:tcPr/>
           <w:p>
@@ -13684,7 +14537,7 @@
         <w:tc>
           <w:tcPr>
             <w:shd w:val="clear" w:color="auto" w:fill="DCE4F2"/>
-            <w:tcW w:w="4522" w:type="dxa"/>
+            <w:tcW w:w="4682" w:type="dxa"/>
           </w:tcPr>
           <w:tcPr/>
           <w:p>
@@ -13700,7 +14553,7 @@
         <w:tc>
           <w:tcPr>
             <w:shd w:val="clear" w:color="auto" w:fill="DCE4F2"/>
-            <w:tcW w:w="2423" w:type="dxa"/>
+            <w:tcW w:w="2695" w:type="dxa"/>
           </w:tcPr>
           <w:tcPr/>
           <w:p>
@@ -13716,7 +14569,7 @@
         <w:tc>
           <w:tcPr>
             <w:shd w:val="clear" w:color="auto" w:fill="DCE4F2"/>
-            <w:tcW w:w="1599" w:type="dxa"/>
+            <w:tcW w:w="1480" w:type="dxa"/>
           </w:tcPr>
           <w:tcPr/>
           <w:p>
@@ -13732,7 +14585,7 @@
         <w:tc>
           <w:tcPr>
             <w:shd w:val="clear" w:color="auto" w:fill="DCE4F2"/>
-            <w:tcW w:w="2445" w:type="dxa"/>
+            <w:tcW w:w="2421" w:type="dxa"/>
           </w:tcPr>
           <w:tcPr/>
           <w:p>
@@ -13748,7 +14601,7 @@
         <w:tc>
           <w:tcPr>
             <w:shd w:val="clear" w:color="auto" w:fill="DCE4F2"/>
-            <w:tcW w:w="1670" w:type="dxa"/>
+            <w:tcW w:w="1545" w:type="dxa"/>
           </w:tcPr>
           <w:tcPr/>
           <w:p>
@@ -13765,7 +14618,7 @@
       <w:tr>
         <w:tc>
           <w:tcPr>
-            <w:tcW w:w="2195" w:type="dxa"/>
+            <w:tcW w:w="2031" w:type="dxa"/>
           </w:tcPr>
           <w:tcPr/>
           <w:p>
@@ -13780,7 +14633,7 @@
         </w:tc>
         <w:tc>
           <w:tcPr>
-            <w:tcW w:w="4522" w:type="dxa"/>
+            <w:tcW w:w="4682" w:type="dxa"/>
           </w:tcPr>
           <w:tcPr/>
           <w:p>
@@ -13821,7 +14674,7 @@
         </w:tc>
         <w:tc>
           <w:tcPr>
-            <w:tcW w:w="2423" w:type="dxa"/>
+            <w:tcW w:w="2695" w:type="dxa"/>
           </w:tcPr>
           <w:tcPr/>
           <w:p>
@@ -13836,18 +14689,18 @@
         </w:tc>
         <w:tc>
           <w:tcPr>
-            <w:tcW w:w="1599" w:type="dxa"/>
-          </w:tcPr>
-          <w:tcPr/>
-          <w:p>
-            <w:pPr>
-              <w:pStyle w:val="Compact"/>
-            </w:pPr>
-          </w:p>
-        </w:tc>
-        <w:tc>
-          <w:tcPr>
-            <w:tcW w:w="2445" w:type="dxa"/>
+            <w:tcW w:w="1480" w:type="dxa"/>
+          </w:tcPr>
+          <w:tcPr/>
+          <w:p>
+            <w:pPr>
+              <w:pStyle w:val="Compact"/>
+            </w:pPr>
+          </w:p>
+        </w:tc>
+        <w:tc>
+          <w:tcPr>
+            <w:tcW w:w="2421" w:type="dxa"/>
           </w:tcPr>
           <w:tcPr/>
           <w:p>
@@ -13862,7 +14715,7 @@
         </w:tc>
         <w:tc>
           <w:tcPr>
-            <w:tcW w:w="1670" w:type="dxa"/>
+            <w:tcW w:w="1545" w:type="dxa"/>
           </w:tcPr>
           <w:tcPr/>
           <w:p>
@@ -13875,7 +14728,7 @@
       <w:tr>
         <w:tc>
           <w:tcPr>
-            <w:tcW w:w="2195" w:type="dxa"/>
+            <w:tcW w:w="2031" w:type="dxa"/>
           </w:tcPr>
           <w:tcPr/>
           <w:p>
@@ -13890,7 +14743,7 @@
         </w:tc>
         <w:tc>
           <w:tcPr>
-            <w:tcW w:w="4522" w:type="dxa"/>
+            <w:tcW w:w="4682" w:type="dxa"/>
           </w:tcPr>
           <w:tcPr/>
           <w:p>
@@ -13931,7 +14784,7 @@
         </w:tc>
         <w:tc>
           <w:tcPr>
-            <w:tcW w:w="2423" w:type="dxa"/>
+            <w:tcW w:w="2695" w:type="dxa"/>
           </w:tcPr>
           <w:tcPr/>
           <w:p>
@@ -13946,18 +14799,18 @@
         </w:tc>
         <w:tc>
           <w:tcPr>
-            <w:tcW w:w="1599" w:type="dxa"/>
-          </w:tcPr>
-          <w:tcPr/>
-          <w:p>
-            <w:pPr>
-              <w:pStyle w:val="Compact"/>
-            </w:pPr>
-          </w:p>
-        </w:tc>
-        <w:tc>
-          <w:tcPr>
-            <w:tcW w:w="2445" w:type="dxa"/>
+            <w:tcW w:w="1480" w:type="dxa"/>
+          </w:tcPr>
+          <w:tcPr/>
+          <w:p>
+            <w:pPr>
+              <w:pStyle w:val="Compact"/>
+            </w:pPr>
+          </w:p>
+        </w:tc>
+        <w:tc>
+          <w:tcPr>
+            <w:tcW w:w="2421" w:type="dxa"/>
           </w:tcPr>
           <w:tcPr/>
           <w:p>
@@ -13972,7 +14825,7 @@
         </w:tc>
         <w:tc>
           <w:tcPr>
-            <w:tcW w:w="1670" w:type="dxa"/>
+            <w:tcW w:w="1545" w:type="dxa"/>
           </w:tcPr>
           <w:tcPr/>
           <w:p>
@@ -13985,7 +14838,7 @@
       <w:tr>
         <w:tc>
           <w:tcPr>
-            <w:tcW w:w="2195" w:type="dxa"/>
+            <w:tcW w:w="2031" w:type="dxa"/>
           </w:tcPr>
           <w:tcPr/>
           <w:p>
@@ -14000,7 +14853,7 @@
         </w:tc>
         <w:tc>
           <w:tcPr>
-            <w:tcW w:w="4522" w:type="dxa"/>
+            <w:tcW w:w="4682" w:type="dxa"/>
           </w:tcPr>
           <w:tcPr/>
           <w:p>
@@ -14057,7 +14910,7 @@
         </w:tc>
         <w:tc>
           <w:tcPr>
-            <w:tcW w:w="2423" w:type="dxa"/>
+            <w:tcW w:w="2695" w:type="dxa"/>
           </w:tcPr>
           <w:tcPr/>
           <w:p>
@@ -14072,18 +14925,18 @@
         </w:tc>
         <w:tc>
           <w:tcPr>
-            <w:tcW w:w="1599" w:type="dxa"/>
-          </w:tcPr>
-          <w:tcPr/>
-          <w:p>
-            <w:pPr>
-              <w:pStyle w:val="Compact"/>
-            </w:pPr>
-          </w:p>
-        </w:tc>
-        <w:tc>
-          <w:tcPr>
-            <w:tcW w:w="2445" w:type="dxa"/>
+            <w:tcW w:w="1480" w:type="dxa"/>
+          </w:tcPr>
+          <w:tcPr/>
+          <w:p>
+            <w:pPr>
+              <w:pStyle w:val="Compact"/>
+            </w:pPr>
+          </w:p>
+        </w:tc>
+        <w:tc>
+          <w:tcPr>
+            <w:tcW w:w="2421" w:type="dxa"/>
           </w:tcPr>
           <w:tcPr/>
           <w:p>
@@ -14098,7 +14951,7 @@
         </w:tc>
         <w:tc>
           <w:tcPr>
-            <w:tcW w:w="1670" w:type="dxa"/>
+            <w:tcW w:w="1545" w:type="dxa"/>
           </w:tcPr>
           <w:tcPr/>
           <w:p>
@@ -14111,7 +14964,7 @@
       <w:tr>
         <w:tc>
           <w:tcPr>
-            <w:tcW w:w="2195" w:type="dxa"/>
+            <w:tcW w:w="2031" w:type="dxa"/>
           </w:tcPr>
           <w:tcPr/>
           <w:p>
@@ -14126,7 +14979,7 @@
         </w:tc>
         <w:tc>
           <w:tcPr>
-            <w:tcW w:w="4522" w:type="dxa"/>
+            <w:tcW w:w="4682" w:type="dxa"/>
           </w:tcPr>
           <w:tcPr/>
           <w:p>
@@ -14167,7 +15020,7 @@
         </w:tc>
         <w:tc>
           <w:tcPr>
-            <w:tcW w:w="2423" w:type="dxa"/>
+            <w:tcW w:w="2695" w:type="dxa"/>
           </w:tcPr>
           <w:tcPr/>
           <w:p>
@@ -14182,18 +15035,18 @@
         </w:tc>
         <w:tc>
           <w:tcPr>
-            <w:tcW w:w="1599" w:type="dxa"/>
-          </w:tcPr>
-          <w:tcPr/>
-          <w:p>
-            <w:pPr>
-              <w:pStyle w:val="Compact"/>
-            </w:pPr>
-          </w:p>
-        </w:tc>
-        <w:tc>
-          <w:tcPr>
-            <w:tcW w:w="2445" w:type="dxa"/>
+            <w:tcW w:w="1480" w:type="dxa"/>
+          </w:tcPr>
+          <w:tcPr/>
+          <w:p>
+            <w:pPr>
+              <w:pStyle w:val="Compact"/>
+            </w:pPr>
+          </w:p>
+        </w:tc>
+        <w:tc>
+          <w:tcPr>
+            <w:tcW w:w="2421" w:type="dxa"/>
           </w:tcPr>
           <w:tcPr/>
           <w:p>
@@ -14208,7 +15061,7 @@
         </w:tc>
         <w:tc>
           <w:tcPr>
-            <w:tcW w:w="1670" w:type="dxa"/>
+            <w:tcW w:w="1545" w:type="dxa"/>
           </w:tcPr>
           <w:tcPr/>
           <w:p>
@@ -14221,7 +15074,7 @@
       <w:tr>
         <w:tc>
           <w:tcPr>
-            <w:tcW w:w="2195" w:type="dxa"/>
+            <w:tcW w:w="2031" w:type="dxa"/>
           </w:tcPr>
           <w:tcPr/>
           <w:p>
@@ -14236,7 +15089,7 @@
         </w:tc>
         <w:tc>
           <w:tcPr>
-            <w:tcW w:w="4522" w:type="dxa"/>
+            <w:tcW w:w="4682" w:type="dxa"/>
           </w:tcPr>
           <w:tcPr/>
           <w:p>
@@ -14293,7 +15146,7 @@
         </w:tc>
         <w:tc>
           <w:tcPr>
-            <w:tcW w:w="2423" w:type="dxa"/>
+            <w:tcW w:w="2695" w:type="dxa"/>
           </w:tcPr>
           <w:tcPr/>
           <w:p>
@@ -14308,18 +15161,18 @@
         </w:tc>
         <w:tc>
           <w:tcPr>
-            <w:tcW w:w="1599" w:type="dxa"/>
-          </w:tcPr>
-          <w:tcPr/>
-          <w:p>
-            <w:pPr>
-              <w:pStyle w:val="Compact"/>
-            </w:pPr>
-          </w:p>
-        </w:tc>
-        <w:tc>
-          <w:tcPr>
-            <w:tcW w:w="2445" w:type="dxa"/>
+            <w:tcW w:w="1480" w:type="dxa"/>
+          </w:tcPr>
+          <w:tcPr/>
+          <w:p>
+            <w:pPr>
+              <w:pStyle w:val="Compact"/>
+            </w:pPr>
+          </w:p>
+        </w:tc>
+        <w:tc>
+          <w:tcPr>
+            <w:tcW w:w="2421" w:type="dxa"/>
           </w:tcPr>
           <w:tcPr/>
           <w:p>
@@ -14334,7 +15187,7 @@
         </w:tc>
         <w:tc>
           <w:tcPr>
-            <w:tcW w:w="1670" w:type="dxa"/>
+            <w:tcW w:w="1545" w:type="dxa"/>
           </w:tcPr>
           <w:tcPr/>
           <w:p>
@@ -14347,7 +15200,7 @@
       <w:tr>
         <w:tc>
           <w:tcPr>
-            <w:tcW w:w="2195" w:type="dxa"/>
+            <w:tcW w:w="2031" w:type="dxa"/>
           </w:tcPr>
           <w:tcPr/>
           <w:p>
@@ -14362,7 +15215,7 @@
         </w:tc>
         <w:tc>
           <w:tcPr>
-            <w:tcW w:w="4522" w:type="dxa"/>
+            <w:tcW w:w="4682" w:type="dxa"/>
           </w:tcPr>
           <w:tcPr/>
           <w:p>
@@ -14387,7 +15240,7 @@
         </w:tc>
         <w:tc>
           <w:tcPr>
-            <w:tcW w:w="2423" w:type="dxa"/>
+            <w:tcW w:w="2695" w:type="dxa"/>
           </w:tcPr>
           <w:tcPr/>
           <w:p>
@@ -14402,18 +15255,18 @@
         </w:tc>
         <w:tc>
           <w:tcPr>
-            <w:tcW w:w="1599" w:type="dxa"/>
-          </w:tcPr>
-          <w:tcPr/>
-          <w:p>
-            <w:pPr>
-              <w:pStyle w:val="Compact"/>
-            </w:pPr>
-          </w:p>
-        </w:tc>
-        <w:tc>
-          <w:tcPr>
-            <w:tcW w:w="2445" w:type="dxa"/>
+            <w:tcW w:w="1480" w:type="dxa"/>
+          </w:tcPr>
+          <w:tcPr/>
+          <w:p>
+            <w:pPr>
+              <w:pStyle w:val="Compact"/>
+            </w:pPr>
+          </w:p>
+        </w:tc>
+        <w:tc>
+          <w:tcPr>
+            <w:tcW w:w="2421" w:type="dxa"/>
           </w:tcPr>
           <w:tcPr/>
           <w:p>
@@ -14428,7 +15281,7 @@
         </w:tc>
         <w:tc>
           <w:tcPr>
-            <w:tcW w:w="1670" w:type="dxa"/>
+            <w:tcW w:w="1545" w:type="dxa"/>
           </w:tcPr>
           <w:tcPr/>
           <w:p>
@@ -14441,7 +15294,7 @@
       <w:tr>
         <w:tc>
           <w:tcPr>
-            <w:tcW w:w="2195" w:type="dxa"/>
+            <w:tcW w:w="2031" w:type="dxa"/>
           </w:tcPr>
           <w:tcPr/>
           <w:p>
@@ -14456,7 +15309,7 @@
         </w:tc>
         <w:tc>
           <w:tcPr>
-            <w:tcW w:w="4522" w:type="dxa"/>
+            <w:tcW w:w="4682" w:type="dxa"/>
           </w:tcPr>
           <w:tcPr/>
           <w:p>
@@ -14503,7 +15356,7 @@
         </w:tc>
         <w:tc>
           <w:tcPr>
-            <w:tcW w:w="2423" w:type="dxa"/>
+            <w:tcW w:w="2695" w:type="dxa"/>
           </w:tcPr>
           <w:tcPr/>
           <w:p>
@@ -14518,18 +15371,18 @@
         </w:tc>
         <w:tc>
           <w:tcPr>
-            <w:tcW w:w="1599" w:type="dxa"/>
-          </w:tcPr>
-          <w:tcPr/>
-          <w:p>
-            <w:pPr>
-              <w:pStyle w:val="Compact"/>
-            </w:pPr>
-          </w:p>
-        </w:tc>
-        <w:tc>
-          <w:tcPr>
-            <w:tcW w:w="2445" w:type="dxa"/>
+            <w:tcW w:w="1480" w:type="dxa"/>
+          </w:tcPr>
+          <w:tcPr/>
+          <w:p>
+            <w:pPr>
+              <w:pStyle w:val="Compact"/>
+            </w:pPr>
+          </w:p>
+        </w:tc>
+        <w:tc>
+          <w:tcPr>
+            <w:tcW w:w="2421" w:type="dxa"/>
           </w:tcPr>
           <w:tcPr/>
           <w:p>
@@ -14544,7 +15397,7 @@
         </w:tc>
         <w:tc>
           <w:tcPr>
-            <w:tcW w:w="1670" w:type="dxa"/>
+            <w:tcW w:w="1545" w:type="dxa"/>
           </w:tcPr>
           <w:tcPr/>
           <w:p>
@@ -14557,7 +15410,7 @@
       <w:tr>
         <w:tc>
           <w:tcPr>
-            <w:tcW w:w="2195" w:type="dxa"/>
+            <w:tcW w:w="2031" w:type="dxa"/>
           </w:tcPr>
           <w:tcPr/>
           <w:p>
@@ -14572,7 +15425,7 @@
         </w:tc>
         <w:tc>
           <w:tcPr>
-            <w:tcW w:w="4522" w:type="dxa"/>
+            <w:tcW w:w="4682" w:type="dxa"/>
           </w:tcPr>
           <w:tcPr/>
           <w:p>
@@ -14613,7 +15466,7 @@
         </w:tc>
         <w:tc>
           <w:tcPr>
-            <w:tcW w:w="2423" w:type="dxa"/>
+            <w:tcW w:w="2695" w:type="dxa"/>
           </w:tcPr>
           <w:tcPr/>
           <w:p>
@@ -14628,18 +15481,18 @@
         </w:tc>
         <w:tc>
           <w:tcPr>
-            <w:tcW w:w="1599" w:type="dxa"/>
-          </w:tcPr>
-          <w:tcPr/>
-          <w:p>
-            <w:pPr>
-              <w:pStyle w:val="Compact"/>
-            </w:pPr>
-          </w:p>
-        </w:tc>
-        <w:tc>
-          <w:tcPr>
-            <w:tcW w:w="2445" w:type="dxa"/>
+            <w:tcW w:w="1480" w:type="dxa"/>
+          </w:tcPr>
+          <w:tcPr/>
+          <w:p>
+            <w:pPr>
+              <w:pStyle w:val="Compact"/>
+            </w:pPr>
+          </w:p>
+        </w:tc>
+        <w:tc>
+          <w:tcPr>
+            <w:tcW w:w="2421" w:type="dxa"/>
           </w:tcPr>
           <w:tcPr/>
           <w:p>
@@ -14654,7 +15507,7 @@
         </w:tc>
         <w:tc>
           <w:tcPr>
-            <w:tcW w:w="1670" w:type="dxa"/>
+            <w:tcW w:w="1545" w:type="dxa"/>
           </w:tcPr>
           <w:tcPr/>
           <w:p>
@@ -14667,7 +15520,7 @@
       <w:tr>
         <w:tc>
           <w:tcPr>
-            <w:tcW w:w="2195" w:type="dxa"/>
+            <w:tcW w:w="2031" w:type="dxa"/>
           </w:tcPr>
           <w:tcPr/>
           <w:p>
@@ -14682,7 +15535,7 @@
         </w:tc>
         <w:tc>
           <w:tcPr>
-            <w:tcW w:w="4522" w:type="dxa"/>
+            <w:tcW w:w="4682" w:type="dxa"/>
           </w:tcPr>
           <w:tcPr/>
           <w:p>
@@ -14723,7 +15576,7 @@
         </w:tc>
         <w:tc>
           <w:tcPr>
-            <w:tcW w:w="2423" w:type="dxa"/>
+            <w:tcW w:w="2695" w:type="dxa"/>
           </w:tcPr>
           <w:tcPr/>
           <w:p>
@@ -14738,18 +15591,18 @@
         </w:tc>
         <w:tc>
           <w:tcPr>
-            <w:tcW w:w="1599" w:type="dxa"/>
-          </w:tcPr>
-          <w:tcPr/>
-          <w:p>
-            <w:pPr>
-              <w:pStyle w:val="Compact"/>
-            </w:pPr>
-          </w:p>
-        </w:tc>
-        <w:tc>
-          <w:tcPr>
-            <w:tcW w:w="2445" w:type="dxa"/>
+            <w:tcW w:w="1480" w:type="dxa"/>
+          </w:tcPr>
+          <w:tcPr/>
+          <w:p>
+            <w:pPr>
+              <w:pStyle w:val="Compact"/>
+            </w:pPr>
+          </w:p>
+        </w:tc>
+        <w:tc>
+          <w:tcPr>
+            <w:tcW w:w="2421" w:type="dxa"/>
           </w:tcPr>
           <w:tcPr/>
           <w:p>
@@ -14764,7 +15617,7 @@
         </w:tc>
         <w:tc>
           <w:tcPr>
-            <w:tcW w:w="1670" w:type="dxa"/>
+            <w:tcW w:w="1545" w:type="dxa"/>
           </w:tcPr>
           <w:tcPr/>
           <w:p>
@@ -14777,7 +15630,7 @@
       <w:tr>
         <w:tc>
           <w:tcPr>
-            <w:tcW w:w="2195" w:type="dxa"/>
+            <w:tcW w:w="2031" w:type="dxa"/>
           </w:tcPr>
           <w:tcPr/>
           <w:p>
@@ -14792,7 +15645,7 @@
         </w:tc>
         <w:tc>
           <w:tcPr>
-            <w:tcW w:w="4522" w:type="dxa"/>
+            <w:tcW w:w="4682" w:type="dxa"/>
           </w:tcPr>
           <w:tcPr/>
           <w:p>
@@ -14823,7 +15676,7 @@
         </w:tc>
         <w:tc>
           <w:tcPr>
-            <w:tcW w:w="2423" w:type="dxa"/>
+            <w:tcW w:w="2695" w:type="dxa"/>
           </w:tcPr>
           <w:tcPr/>
           <w:p>
@@ -14838,18 +15691,18 @@
         </w:tc>
         <w:tc>
           <w:tcPr>
-            <w:tcW w:w="1599" w:type="dxa"/>
-          </w:tcPr>
-          <w:tcPr/>
-          <w:p>
-            <w:pPr>
-              <w:pStyle w:val="Compact"/>
-            </w:pPr>
-          </w:p>
-        </w:tc>
-        <w:tc>
-          <w:tcPr>
-            <w:tcW w:w="2445" w:type="dxa"/>
+            <w:tcW w:w="1480" w:type="dxa"/>
+          </w:tcPr>
+          <w:tcPr/>
+          <w:p>
+            <w:pPr>
+              <w:pStyle w:val="Compact"/>
+            </w:pPr>
+          </w:p>
+        </w:tc>
+        <w:tc>
+          <w:tcPr>
+            <w:tcW w:w="2421" w:type="dxa"/>
           </w:tcPr>
           <w:tcPr/>
           <w:p>
@@ -14864,7 +15717,7 @@
         </w:tc>
         <w:tc>
           <w:tcPr>
-            <w:tcW w:w="1670" w:type="dxa"/>
+            <w:tcW w:w="1545" w:type="dxa"/>
           </w:tcPr>
           <w:tcPr/>
           <w:p>
@@ -14877,7 +15730,7 @@
       <w:tr>
         <w:tc>
           <w:tcPr>
-            <w:tcW w:w="2195" w:type="dxa"/>
+            <w:tcW w:w="2031" w:type="dxa"/>
           </w:tcPr>
           <w:tcPr/>
           <w:p>
@@ -14892,7 +15745,7 @@
         </w:tc>
         <w:tc>
           <w:tcPr>
-            <w:tcW w:w="4522" w:type="dxa"/>
+            <w:tcW w:w="4682" w:type="dxa"/>
           </w:tcPr>
           <w:tcPr/>
           <w:p>
@@ -14907,7 +15760,7 @@
         </w:tc>
         <w:tc>
           <w:tcPr>
-            <w:tcW w:w="2423" w:type="dxa"/>
+            <w:tcW w:w="2695" w:type="dxa"/>
           </w:tcPr>
           <w:tcPr/>
           <w:p>
@@ -14922,18 +15775,18 @@
         </w:tc>
         <w:tc>
           <w:tcPr>
-            <w:tcW w:w="1599" w:type="dxa"/>
-          </w:tcPr>
-          <w:tcPr/>
-          <w:p>
-            <w:pPr>
-              <w:pStyle w:val="Compact"/>
-            </w:pPr>
-          </w:p>
-        </w:tc>
-        <w:tc>
-          <w:tcPr>
-            <w:tcW w:w="2445" w:type="dxa"/>
+            <w:tcW w:w="1480" w:type="dxa"/>
+          </w:tcPr>
+          <w:tcPr/>
+          <w:p>
+            <w:pPr>
+              <w:pStyle w:val="Compact"/>
+            </w:pPr>
+          </w:p>
+        </w:tc>
+        <w:tc>
+          <w:tcPr>
+            <w:tcW w:w="2421" w:type="dxa"/>
           </w:tcPr>
           <w:tcPr/>
           <w:p>
@@ -14948,7 +15801,317 @@
         </w:tc>
         <w:tc>
           <w:tcPr>
-            <w:tcW w:w="1670" w:type="dxa"/>
+            <w:tcW w:w="1545" w:type="dxa"/>
+          </w:tcPr>
+          <w:tcPr/>
+          <w:p>
+            <w:pPr>
+              <w:pStyle w:val="Compact"/>
+            </w:pPr>
+          </w:p>
+        </w:tc>
+      </w:tr>
+      <w:tr>
+        <w:tc>
+          <w:tcPr>
+            <w:tcW w:w="2031" w:type="dxa"/>
+          </w:tcPr>
+          <w:tcPr/>
+          <w:p>
+            <w:pPr>
+              <w:pStyle w:val="Compact"/>
+              <w:jc w:val="left"/>
+            </w:pPr>
+            <w:r>
+              <w:t xml:space="preserve">B.0.12</w:t>
+            </w:r>
+          </w:p>
+        </w:tc>
+        <w:tc>
+          <w:tcPr>
+            <w:tcW w:w="4682" w:type="dxa"/>
+          </w:tcPr>
+          <w:tcPr/>
+          <w:p>
+            <w:pPr>
+              <w:pStyle w:val="Compact"/>
+              <w:jc w:val="left"/>
+            </w:pPr>
+            <w:r>
+              <w:t xml:space="preserve">Falls Weg A:</w:t>
+            </w:r>
+            <w:r>
+              <w:t xml:space="preserve"> </w:t>
+            </w:r>
+            <w:r>
+              <w:rPr>
+                <w:bCs/>
+                <w:b/>
+              </w:rPr>
+              <w:t xml:space="preserve">Konkreten Rechtsakt aus Anhang I benennen und Abschnitt bestimmen (A oder B).</w:t>
+            </w:r>
+            <w:r>
+              <w:t xml:space="preserve"> </w:t>
+            </w:r>
+            <w:r>
+              <w:t xml:space="preserve">Bei</w:t>
+            </w:r>
+            <w:r>
+              <w:t xml:space="preserve"> </w:t>
+            </w:r>
+            <w:r>
+              <w:rPr>
+                <w:bCs/>
+                <w:b/>
+              </w:rPr>
+              <w:t xml:space="preserve">Abschnitt B</w:t>
+            </w:r>
+            <w:r>
+              <w:t xml:space="preserve"> </w:t>
+            </w:r>
+            <w:r>
+              <w:t xml:space="preserve">gelten von der KI-VO nur Art. 6 Abs. 1, Art. 60a und Art. 102–112 — diese Checkliste ist dann nicht anwendbar; maßgeblich ist das Sektorrecht (bei Maschinen: Anhang III der VO (EU) 2023/1230, delegierter Rechtsakt ab 02.08.2028).</w:t>
+            </w:r>
+          </w:p>
+        </w:tc>
+        <w:tc>
+          <w:tcPr>
+            <w:tcW w:w="2695" w:type="dxa"/>
+          </w:tcPr>
+          <w:tcPr/>
+          <w:p>
+            <w:pPr>
+              <w:pStyle w:val="Compact"/>
+              <w:jc w:val="left"/>
+            </w:pPr>
+            <w:r>
+              <w:t xml:space="preserve">Anhang I; Art. 2 Abs. 2 n. F.; VO (EU) 2026/1744 Art. 1 Nr. 41 und Art. 3</w:t>
+            </w:r>
+          </w:p>
+        </w:tc>
+        <w:tc>
+          <w:tcPr>
+            <w:tcW w:w="1480" w:type="dxa"/>
+          </w:tcPr>
+          <w:tcPr/>
+          <w:p>
+            <w:pPr>
+              <w:pStyle w:val="Compact"/>
+            </w:pPr>
+          </w:p>
+        </w:tc>
+        <w:tc>
+          <w:tcPr>
+            <w:tcW w:w="2421" w:type="dxa"/>
+          </w:tcPr>
+          <w:tcPr/>
+          <w:p>
+            <w:pPr>
+              <w:pStyle w:val="Compact"/>
+              <w:jc w:val="left"/>
+            </w:pPr>
+            <w:r>
+              <w:t xml:space="preserve">Rechtsaktbestimmung mit Nummer und Abschnitt</w:t>
+            </w:r>
+          </w:p>
+        </w:tc>
+        <w:tc>
+          <w:tcPr>
+            <w:tcW w:w="1545" w:type="dxa"/>
+          </w:tcPr>
+          <w:tcPr/>
+          <w:p>
+            <w:pPr>
+              <w:pStyle w:val="Compact"/>
+            </w:pPr>
+          </w:p>
+        </w:tc>
+      </w:tr>
+      <w:tr>
+        <w:tc>
+          <w:tcPr>
+            <w:tcW w:w="2031" w:type="dxa"/>
+          </w:tcPr>
+          <w:tcPr/>
+          <w:p>
+            <w:pPr>
+              <w:pStyle w:val="Compact"/>
+              <w:jc w:val="left"/>
+            </w:pPr>
+            <w:r>
+              <w:t xml:space="preserve">B.0.13</w:t>
+            </w:r>
+          </w:p>
+        </w:tc>
+        <w:tc>
+          <w:tcPr>
+            <w:tcW w:w="4682" w:type="dxa"/>
+          </w:tcPr>
+          <w:tcPr/>
+          <w:p>
+            <w:pPr>
+              <w:pStyle w:val="Compact"/>
+              <w:jc w:val="left"/>
+            </w:pPr>
+            <w:r>
+              <w:t xml:space="preserve">Bei</w:t>
+            </w:r>
+            <w:r>
+              <w:t xml:space="preserve"> </w:t>
+            </w:r>
+            <w:r>
+              <w:rPr>
+                <w:bCs/>
+                <w:b/>
+              </w:rPr>
+              <w:t xml:space="preserve">Abschnitt A</w:t>
+            </w:r>
+            <w:r>
+              <w:t xml:space="preserve">: delegierte Rechtsakte nach Art. 2 Abs. 13 KI-VO n. F. beobachten (Frist der Kommission: 02.08.2027) — sie können die Anwendung der Art. 9–15 und 17–25 beschränken.</w:t>
+            </w:r>
+          </w:p>
+        </w:tc>
+        <w:tc>
+          <w:tcPr>
+            <w:tcW w:w="2695" w:type="dxa"/>
+          </w:tcPr>
+          <w:tcPr/>
+          <w:p>
+            <w:pPr>
+              <w:pStyle w:val="Compact"/>
+              <w:jc w:val="left"/>
+            </w:pPr>
+            <w:r>
+              <w:t xml:space="preserve">Art. 2 Abs. 13 n. F.</w:t>
+            </w:r>
+          </w:p>
+        </w:tc>
+        <w:tc>
+          <w:tcPr>
+            <w:tcW w:w="1480" w:type="dxa"/>
+          </w:tcPr>
+          <w:tcPr/>
+          <w:p>
+            <w:pPr>
+              <w:pStyle w:val="Compact"/>
+            </w:pPr>
+          </w:p>
+        </w:tc>
+        <w:tc>
+          <w:tcPr>
+            <w:tcW w:w="2421" w:type="dxa"/>
+          </w:tcPr>
+          <w:tcPr/>
+          <w:p>
+            <w:pPr>
+              <w:pStyle w:val="Compact"/>
+              <w:jc w:val="left"/>
+            </w:pPr>
+            <w:r>
+              <w:t xml:space="preserve">Beobachtungsvermerk</w:t>
+            </w:r>
+          </w:p>
+        </w:tc>
+        <w:tc>
+          <w:tcPr>
+            <w:tcW w:w="1545" w:type="dxa"/>
+          </w:tcPr>
+          <w:tcPr/>
+          <w:p>
+            <w:pPr>
+              <w:pStyle w:val="Compact"/>
+            </w:pPr>
+          </w:p>
+        </w:tc>
+      </w:tr>
+      <w:tr>
+        <w:tc>
+          <w:tcPr>
+            <w:tcW w:w="2031" w:type="dxa"/>
+          </w:tcPr>
+          <w:tcPr/>
+          <w:p>
+            <w:pPr>
+              <w:pStyle w:val="Compact"/>
+              <w:jc w:val="left"/>
+            </w:pPr>
+            <w:r>
+              <w:t xml:space="preserve">B.0.14</w:t>
+            </w:r>
+          </w:p>
+        </w:tc>
+        <w:tc>
+          <w:tcPr>
+            <w:tcW w:w="4682" w:type="dxa"/>
+          </w:tcPr>
+          <w:tcPr/>
+          <w:p>
+            <w:pPr>
+              <w:pStyle w:val="Compact"/>
+              <w:jc w:val="left"/>
+            </w:pPr>
+            <w:r>
+              <w:t xml:space="preserve">Ist die Einstufung</w:t>
+            </w:r>
+            <w:r>
+              <w:t xml:space="preserve"> </w:t>
+            </w:r>
+            <w:r>
+              <w:rPr>
+                <w:bCs/>
+                <w:b/>
+              </w:rPr>
+              <w:t xml:space="preserve">juristisch bestätigt</w:t>
+            </w:r>
+            <w:r>
+              <w:t xml:space="preserve">? Ja / Nein / offen, mit Datum und prüfender Person festhalten.</w:t>
+            </w:r>
+          </w:p>
+        </w:tc>
+        <w:tc>
+          <w:tcPr>
+            <w:tcW w:w="2695" w:type="dxa"/>
+          </w:tcPr>
+          <w:tcPr/>
+          <w:p>
+            <w:pPr>
+              <w:pStyle w:val="Compact"/>
+              <w:jc w:val="left"/>
+            </w:pPr>
+            <w:r>
+              <w:t xml:space="preserve">(Nachweisführung)</w:t>
+            </w:r>
+          </w:p>
+        </w:tc>
+        <w:tc>
+          <w:tcPr>
+            <w:tcW w:w="1480" w:type="dxa"/>
+          </w:tcPr>
+          <w:tcPr/>
+          <w:p>
+            <w:pPr>
+              <w:pStyle w:val="Compact"/>
+            </w:pPr>
+          </w:p>
+        </w:tc>
+        <w:tc>
+          <w:tcPr>
+            <w:tcW w:w="2421" w:type="dxa"/>
+          </w:tcPr>
+          <w:tcPr/>
+          <w:p>
+            <w:pPr>
+              <w:pStyle w:val="Compact"/>
+              <w:jc w:val="left"/>
+            </w:pPr>
+            <w:r>
+              <w:t xml:space="preserve">Prüfvermerk</w:t>
+            </w:r>
+          </w:p>
+        </w:tc>
+        <w:tc>
+          <w:tcPr>
+            <w:tcW w:w="1545" w:type="dxa"/>
           </w:tcPr>
           <w:tcPr/>
           <w:p>
@@ -15827,12 +16990,12 @@
         <w:jc w:val="start"/>
       </w:tblPr>
       <w:tblGrid>
-        <w:gridCol w:w="2158"/>
-        <w:gridCol w:w="4356"/>
-        <w:gridCol w:w="2749"/>
-        <w:gridCol w:w="1580"/>
-        <w:gridCol w:w="2361"/>
-        <w:gridCol w:w="1650"/>
+        <w:gridCol w:w="1886"/>
+        <w:gridCol w:w="4979"/>
+        <w:gridCol w:w="2465"/>
+        <w:gridCol w:w="1382"/>
+        <w:gridCol w:w="2700"/>
+        <w:gridCol w:w="1442"/>
       </w:tblGrid>
       <w:tr>
         <w:trPr>
@@ -15843,7 +17006,7 @@
         <w:tc>
           <w:tcPr>
             <w:shd w:val="clear" w:color="auto" w:fill="DCE4F2"/>
-            <w:tcW w:w="2158" w:type="dxa"/>
+            <w:tcW w:w="1886" w:type="dxa"/>
           </w:tcPr>
           <w:tcPr/>
           <w:p>
@@ -15859,7 +17022,7 @@
         <w:tc>
           <w:tcPr>
             <w:shd w:val="clear" w:color="auto" w:fill="DCE4F2"/>
-            <w:tcW w:w="4356" w:type="dxa"/>
+            <w:tcW w:w="4979" w:type="dxa"/>
           </w:tcPr>
           <w:tcPr/>
           <w:p>
@@ -15875,7 +17038,7 @@
         <w:tc>
           <w:tcPr>
             <w:shd w:val="clear" w:color="auto" w:fill="DCE4F2"/>
-            <w:tcW w:w="2749" w:type="dxa"/>
+            <w:tcW w:w="2465" w:type="dxa"/>
           </w:tcPr>
           <w:tcPr/>
           <w:p>
@@ -15891,7 +17054,7 @@
         <w:tc>
           <w:tcPr>
             <w:shd w:val="clear" w:color="auto" w:fill="DCE4F2"/>
-            <w:tcW w:w="1580" w:type="dxa"/>
+            <w:tcW w:w="1382" w:type="dxa"/>
           </w:tcPr>
           <w:tcPr/>
           <w:p>
@@ -15907,7 +17070,7 @@
         <w:tc>
           <w:tcPr>
             <w:shd w:val="clear" w:color="auto" w:fill="DCE4F2"/>
-            <w:tcW w:w="2361" w:type="dxa"/>
+            <w:tcW w:w="2700" w:type="dxa"/>
           </w:tcPr>
           <w:tcPr/>
           <w:p>
@@ -15923,7 +17086,7 @@
         <w:tc>
           <w:tcPr>
             <w:shd w:val="clear" w:color="auto" w:fill="DCE4F2"/>
-            <w:tcW w:w="1650" w:type="dxa"/>
+            <w:tcW w:w="1442" w:type="dxa"/>
           </w:tcPr>
           <w:tcPr/>
           <w:p>
@@ -15940,7 +17103,7 @@
       <w:tr>
         <w:tc>
           <w:tcPr>
-            <w:tcW w:w="2158" w:type="dxa"/>
+            <w:tcW w:w="1886" w:type="dxa"/>
           </w:tcPr>
           <w:tcPr/>
           <w:p>
@@ -15955,7 +17118,7 @@
         </w:tc>
         <w:tc>
           <w:tcPr>
-            <w:tcW w:w="4356" w:type="dxa"/>
+            <w:tcW w:w="4979" w:type="dxa"/>
           </w:tcPr>
           <w:tcPr/>
           <w:p>
@@ -15980,7 +17143,7 @@
         </w:tc>
         <w:tc>
           <w:tcPr>
-            <w:tcW w:w="2749" w:type="dxa"/>
+            <w:tcW w:w="2465" w:type="dxa"/>
           </w:tcPr>
           <w:tcPr/>
           <w:p>
@@ -15995,18 +17158,18 @@
         </w:tc>
         <w:tc>
           <w:tcPr>
-            <w:tcW w:w="1580" w:type="dxa"/>
-          </w:tcPr>
-          <w:tcPr/>
-          <w:p>
-            <w:pPr>
-              <w:pStyle w:val="Compact"/>
-            </w:pPr>
-          </w:p>
-        </w:tc>
-        <w:tc>
-          <w:tcPr>
-            <w:tcW w:w="2361" w:type="dxa"/>
+            <w:tcW w:w="1382" w:type="dxa"/>
+          </w:tcPr>
+          <w:tcPr/>
+          <w:p>
+            <w:pPr>
+              <w:pStyle w:val="Compact"/>
+            </w:pPr>
+          </w:p>
+        </w:tc>
+        <w:tc>
+          <w:tcPr>
+            <w:tcW w:w="2700" w:type="dxa"/>
           </w:tcPr>
           <w:tcPr/>
           <w:p>
@@ -16021,7 +17184,7 @@
         </w:tc>
         <w:tc>
           <w:tcPr>
-            <w:tcW w:w="1650" w:type="dxa"/>
+            <w:tcW w:w="1442" w:type="dxa"/>
           </w:tcPr>
           <w:tcPr/>
           <w:p>
@@ -16034,7 +17197,7 @@
       <w:tr>
         <w:tc>
           <w:tcPr>
-            <w:tcW w:w="2158" w:type="dxa"/>
+            <w:tcW w:w="1886" w:type="dxa"/>
           </w:tcPr>
           <w:tcPr/>
           <w:p>
@@ -16049,7 +17212,7 @@
         </w:tc>
         <w:tc>
           <w:tcPr>
-            <w:tcW w:w="4356" w:type="dxa"/>
+            <w:tcW w:w="4979" w:type="dxa"/>
           </w:tcPr>
           <w:tcPr/>
           <w:p>
@@ -16080,7 +17243,7 @@
         </w:tc>
         <w:tc>
           <w:tcPr>
-            <w:tcW w:w="2749" w:type="dxa"/>
+            <w:tcW w:w="2465" w:type="dxa"/>
           </w:tcPr>
           <w:tcPr/>
           <w:p>
@@ -16095,18 +17258,18 @@
         </w:tc>
         <w:tc>
           <w:tcPr>
-            <w:tcW w:w="1580" w:type="dxa"/>
-          </w:tcPr>
-          <w:tcPr/>
-          <w:p>
-            <w:pPr>
-              <w:pStyle w:val="Compact"/>
-            </w:pPr>
-          </w:p>
-        </w:tc>
-        <w:tc>
-          <w:tcPr>
-            <w:tcW w:w="2361" w:type="dxa"/>
+            <w:tcW w:w="1382" w:type="dxa"/>
+          </w:tcPr>
+          <w:tcPr/>
+          <w:p>
+            <w:pPr>
+              <w:pStyle w:val="Compact"/>
+            </w:pPr>
+          </w:p>
+        </w:tc>
+        <w:tc>
+          <w:tcPr>
+            <w:tcW w:w="2700" w:type="dxa"/>
           </w:tcPr>
           <w:tcPr/>
           <w:p>
@@ -16121,7 +17284,7 @@
         </w:tc>
         <w:tc>
           <w:tcPr>
-            <w:tcW w:w="1650" w:type="dxa"/>
+            <w:tcW w:w="1442" w:type="dxa"/>
           </w:tcPr>
           <w:tcPr/>
           <w:p>
@@ -16134,7 +17297,7 @@
       <w:tr>
         <w:tc>
           <w:tcPr>
-            <w:tcW w:w="2158" w:type="dxa"/>
+            <w:tcW w:w="1886" w:type="dxa"/>
           </w:tcPr>
           <w:tcPr/>
           <w:p>
@@ -16149,7 +17312,7 @@
         </w:tc>
         <w:tc>
           <w:tcPr>
-            <w:tcW w:w="4356" w:type="dxa"/>
+            <w:tcW w:w="4979" w:type="dxa"/>
           </w:tcPr>
           <w:tcPr/>
           <w:p>
@@ -16180,7 +17343,7 @@
         </w:tc>
         <w:tc>
           <w:tcPr>
-            <w:tcW w:w="2749" w:type="dxa"/>
+            <w:tcW w:w="2465" w:type="dxa"/>
           </w:tcPr>
           <w:tcPr/>
           <w:p>
@@ -16195,18 +17358,18 @@
         </w:tc>
         <w:tc>
           <w:tcPr>
-            <w:tcW w:w="1580" w:type="dxa"/>
-          </w:tcPr>
-          <w:tcPr/>
-          <w:p>
-            <w:pPr>
-              <w:pStyle w:val="Compact"/>
-            </w:pPr>
-          </w:p>
-        </w:tc>
-        <w:tc>
-          <w:tcPr>
-            <w:tcW w:w="2361" w:type="dxa"/>
+            <w:tcW w:w="1382" w:type="dxa"/>
+          </w:tcPr>
+          <w:tcPr/>
+          <w:p>
+            <w:pPr>
+              <w:pStyle w:val="Compact"/>
+            </w:pPr>
+          </w:p>
+        </w:tc>
+        <w:tc>
+          <w:tcPr>
+            <w:tcW w:w="2700" w:type="dxa"/>
           </w:tcPr>
           <w:tcPr/>
           <w:p>
@@ -16221,7 +17384,7 @@
         </w:tc>
         <w:tc>
           <w:tcPr>
-            <w:tcW w:w="1650" w:type="dxa"/>
+            <w:tcW w:w="1442" w:type="dxa"/>
           </w:tcPr>
           <w:tcPr/>
           <w:p>
@@ -16234,7 +17397,7 @@
       <w:tr>
         <w:tc>
           <w:tcPr>
-            <w:tcW w:w="2158" w:type="dxa"/>
+            <w:tcW w:w="1886" w:type="dxa"/>
           </w:tcPr>
           <w:tcPr/>
           <w:p>
@@ -16249,7 +17412,7 @@
         </w:tc>
         <w:tc>
           <w:tcPr>
-            <w:tcW w:w="4356" w:type="dxa"/>
+            <w:tcW w:w="4979" w:type="dxa"/>
           </w:tcPr>
           <w:tcPr/>
           <w:p>
@@ -16277,7 +17440,7 @@
         </w:tc>
         <w:tc>
           <w:tcPr>
-            <w:tcW w:w="2749" w:type="dxa"/>
+            <w:tcW w:w="2465" w:type="dxa"/>
           </w:tcPr>
           <w:tcPr/>
           <w:p>
@@ -16292,18 +17455,18 @@
         </w:tc>
         <w:tc>
           <w:tcPr>
-            <w:tcW w:w="1580" w:type="dxa"/>
-          </w:tcPr>
-          <w:tcPr/>
-          <w:p>
-            <w:pPr>
-              <w:pStyle w:val="Compact"/>
-            </w:pPr>
-          </w:p>
-        </w:tc>
-        <w:tc>
-          <w:tcPr>
-            <w:tcW w:w="2361" w:type="dxa"/>
+            <w:tcW w:w="1382" w:type="dxa"/>
+          </w:tcPr>
+          <w:tcPr/>
+          <w:p>
+            <w:pPr>
+              <w:pStyle w:val="Compact"/>
+            </w:pPr>
+          </w:p>
+        </w:tc>
+        <w:tc>
+          <w:tcPr>
+            <w:tcW w:w="2700" w:type="dxa"/>
           </w:tcPr>
           <w:tcPr/>
           <w:p>
@@ -16318,7 +17481,7 @@
         </w:tc>
         <w:tc>
           <w:tcPr>
-            <w:tcW w:w="1650" w:type="dxa"/>
+            <w:tcW w:w="1442" w:type="dxa"/>
           </w:tcPr>
           <w:tcPr/>
           <w:p>
@@ -16331,7 +17494,7 @@
       <w:tr>
         <w:tc>
           <w:tcPr>
-            <w:tcW w:w="2158" w:type="dxa"/>
+            <w:tcW w:w="1886" w:type="dxa"/>
           </w:tcPr>
           <w:tcPr/>
           <w:p>
@@ -16346,7 +17509,7 @@
         </w:tc>
         <w:tc>
           <w:tcPr>
-            <w:tcW w:w="4356" w:type="dxa"/>
+            <w:tcW w:w="4979" w:type="dxa"/>
           </w:tcPr>
           <w:tcPr/>
           <w:p>
@@ -16365,7 +17528,7 @@
               <w:t xml:space="preserve"> </w:t>
             </w:r>
             <w:r>
-              <w:t xml:space="preserve">Verarbeitung besonderer Kategorien personenbezogener Daten zur Erkennung und Korrektur von Verzerrungen nur unter den</w:t>
+              <w:t xml:space="preserve">Als</w:t>
             </w:r>
             <w:r>
               <w:t xml:space="preserve"> </w:t>
@@ -16375,13 +17538,48 @@
                 <w:bCs/>
                 <w:b/>
               </w:rPr>
-              <w:t xml:space="preserve">kumulativen</w:t>
-            </w:r>
-            <w:r>
-              <w:t xml:space="preserve"> </w:t>
-            </w:r>
-            <w:r>
-              <w:t xml:space="preserve">Bedingungen des Art. 4a Abs. 1 lit. a–f. </w:t>
+              <w:t xml:space="preserve">Anbieter eines Hochrisiko-Systems</w:t>
+            </w:r>
+            <w:r>
+              <w:t xml:space="preserve"> </w:t>
+            </w:r>
+            <w:r>
+              <w:t xml:space="preserve">dürfen besondere Kategorien personenbezogener Daten zur Erkennung und Korrektur von Verzerrungen verarbeitet werden, soweit das im Einklang mit Art. 10 Abs. 2 lit. f und g</w:t>
+            </w:r>
+            <w:r>
+              <w:t xml:space="preserve"> </w:t>
+            </w:r>
+            <w:r>
+              <w:rPr>
+                <w:bCs/>
+                <w:b/>
+              </w:rPr>
+              <w:t xml:space="preserve">unbedingt erforderlich</w:t>
+            </w:r>
+            <w:r>
+              <w:t xml:space="preserve"> </w:t>
+            </w:r>
+            <w:r>
+              <w:t xml:space="preserve">ist und</w:t>
+            </w:r>
+            <w:r>
+              <w:t xml:space="preserve"> </w:t>
+            </w:r>
+            <w:r>
+              <w:rPr>
+                <w:bCs/>
+                <w:b/>
+              </w:rPr>
+              <w:t xml:space="preserve">sämtliche</w:t>
+            </w:r>
+            <w:r>
+              <w:t xml:space="preserve"> </w:t>
+            </w:r>
+            <w:r>
+              <w:t xml:space="preserve">Bedingungen des Art. 4a Abs. 1 lit. a–f erfüllt sind.</w:t>
+            </w:r>
+            <w:r>
+              <w:t xml:space="preserve"> </w:t>
             </w:r>
             <w:r>
               <w:rPr>
@@ -16390,52 +17588,168 @@
               </w:rPr>
               <w:t xml:space="preserve">Art. 10 Abs. 5 a. F. wurde gestrichen.</w:t>
             </w:r>
-          </w:p>
-        </w:tc>
-        <w:tc>
-          <w:tcPr>
-            <w:tcW w:w="2749" w:type="dxa"/>
-          </w:tcPr>
-          <w:tcPr/>
-          <w:p>
-            <w:pPr>
-              <w:pStyle w:val="Compact"/>
-              <w:jc w:val="left"/>
-            </w:pPr>
-            <w:r>
-              <w:t xml:space="preserve">Art. 4a KI-VO n. F. (VO (EU) 2026/1744, Art. 1 Nrn. 6 und 9)</w:t>
-            </w:r>
-          </w:p>
-        </w:tc>
-        <w:tc>
-          <w:tcPr>
-            <w:tcW w:w="1580" w:type="dxa"/>
-          </w:tcPr>
-          <w:tcPr/>
-          <w:p>
-            <w:pPr>
-              <w:pStyle w:val="Compact"/>
-            </w:pPr>
-          </w:p>
-        </w:tc>
-        <w:tc>
-          <w:tcPr>
-            <w:tcW w:w="2361" w:type="dxa"/>
-          </w:tcPr>
-          <w:tcPr/>
-          <w:p>
-            <w:pPr>
-              <w:pStyle w:val="Compact"/>
-              <w:jc w:val="left"/>
-            </w:pPr>
-            <w:r>
-              <w:t xml:space="preserve">Rechtsgrundlagenprüfung</w:t>
-            </w:r>
-          </w:p>
-        </w:tc>
-        <w:tc>
-          <w:tcPr>
-            <w:tcW w:w="1650" w:type="dxa"/>
+            <w:r>
+              <w:t xml:space="preserve"> </w:t>
+            </w:r>
+            <w:r>
+              <w:t xml:space="preserve">Anwendbar seit 27.07.2026 — also bereits vor der HR-Frist.</w:t>
+            </w:r>
+          </w:p>
+        </w:tc>
+        <w:tc>
+          <w:tcPr>
+            <w:tcW w:w="2465" w:type="dxa"/>
+          </w:tcPr>
+          <w:tcPr/>
+          <w:p>
+            <w:pPr>
+              <w:pStyle w:val="Compact"/>
+              <w:jc w:val="left"/>
+            </w:pPr>
+            <w:r>
+              <w:t xml:space="preserve">Art. 4a Abs. 1 KI-VO n. F. (VO (EU) 2026/1744, Art. 1 Nrn. 6 und 9)</w:t>
+            </w:r>
+          </w:p>
+        </w:tc>
+        <w:tc>
+          <w:tcPr>
+            <w:tcW w:w="1382" w:type="dxa"/>
+          </w:tcPr>
+          <w:tcPr/>
+          <w:p>
+            <w:pPr>
+              <w:pStyle w:val="Compact"/>
+            </w:pPr>
+          </w:p>
+        </w:tc>
+        <w:tc>
+          <w:tcPr>
+            <w:tcW w:w="2700" w:type="dxa"/>
+          </w:tcPr>
+          <w:tcPr/>
+          <w:p>
+            <w:pPr>
+              <w:pStyle w:val="Compact"/>
+              <w:jc w:val="left"/>
+            </w:pPr>
+            <w:r>
+              <w:t xml:space="preserve">Rechtsgrundlagenprüfung, Löschkonzept (lit. e), Begründung im Verarbeitungsverzeichnis (lit. f)</w:t>
+            </w:r>
+          </w:p>
+        </w:tc>
+        <w:tc>
+          <w:tcPr>
+            <w:tcW w:w="1442" w:type="dxa"/>
+          </w:tcPr>
+          <w:tcPr/>
+          <w:p>
+            <w:pPr>
+              <w:pStyle w:val="Compact"/>
+            </w:pPr>
+          </w:p>
+        </w:tc>
+      </w:tr>
+      <w:tr>
+        <w:tc>
+          <w:tcPr>
+            <w:tcW w:w="1886" w:type="dxa"/>
+          </w:tcPr>
+          <w:tcPr/>
+          <w:p>
+            <w:pPr>
+              <w:pStyle w:val="Compact"/>
+              <w:jc w:val="left"/>
+            </w:pPr>
+            <w:r>
+              <w:t xml:space="preserve">B.2.6</w:t>
+            </w:r>
+          </w:p>
+        </w:tc>
+        <w:tc>
+          <w:tcPr>
+            <w:tcW w:w="4979" w:type="dxa"/>
+          </w:tcPr>
+          <w:tcPr/>
+          <w:p>
+            <w:pPr>
+              <w:pStyle w:val="Compact"/>
+              <w:jc w:val="left"/>
+            </w:pPr>
+            <w:r>
+              <w:rPr>
+                <w:bCs/>
+                <w:b/>
+              </w:rPr>
+              <w:t xml:space="preserve">Abgrenzung:</w:t>
+            </w:r>
+            <w:r>
+              <w:t xml:space="preserve"> </w:t>
+            </w:r>
+            <w:r>
+              <w:t xml:space="preserve">Die Bedingungen des Art. 4a gelten</w:t>
+            </w:r>
+            <w:r>
+              <w:t xml:space="preserve"> </w:t>
+            </w:r>
+            <w:r>
+              <w:rPr>
+                <w:bCs/>
+                <w:b/>
+              </w:rPr>
+              <w:t xml:space="preserve">zusätzlich</w:t>
+            </w:r>
+            <w:r>
+              <w:t xml:space="preserve"> </w:t>
+            </w:r>
+            <w:r>
+              <w:t xml:space="preserve">zu DSGVO, VO (EU) 2018/1725 und RL (EU) 2016/680 — sie ersetzen die datenschutzrechtliche Prüfung nicht.</w:t>
+            </w:r>
+          </w:p>
+        </w:tc>
+        <w:tc>
+          <w:tcPr>
+            <w:tcW w:w="2465" w:type="dxa"/>
+          </w:tcPr>
+          <w:tcPr/>
+          <w:p>
+            <w:pPr>
+              <w:pStyle w:val="Compact"/>
+              <w:jc w:val="left"/>
+            </w:pPr>
+            <w:r>
+              <w:t xml:space="preserve">Art. 4a Abs. 1 UAbs. 1 KI-VO n. F.</w:t>
+            </w:r>
+          </w:p>
+        </w:tc>
+        <w:tc>
+          <w:tcPr>
+            <w:tcW w:w="1382" w:type="dxa"/>
+          </w:tcPr>
+          <w:tcPr/>
+          <w:p>
+            <w:pPr>
+              <w:pStyle w:val="Compact"/>
+            </w:pPr>
+          </w:p>
+        </w:tc>
+        <w:tc>
+          <w:tcPr>
+            <w:tcW w:w="2700" w:type="dxa"/>
+          </w:tcPr>
+          <w:tcPr/>
+          <w:p>
+            <w:pPr>
+              <w:pStyle w:val="Compact"/>
+              <w:jc w:val="left"/>
+            </w:pPr>
+            <w:r>
+              <w:t xml:space="preserve">Datenschutzrechtliche Bewertung</w:t>
+            </w:r>
+          </w:p>
+        </w:tc>
+        <w:tc>
+          <w:tcPr>
+            <w:tcW w:w="1442" w:type="dxa"/>
           </w:tcPr>
           <w:tcPr/>
           <w:p>
@@ -26502,9 +27816,9 @@
         <w:jc w:val="start"/>
       </w:tblPr>
       <w:tblGrid>
-        <w:gridCol w:w="4525"/>
-        <w:gridCol w:w="5369"/>
-        <w:gridCol w:w="4960"/>
+        <w:gridCol w:w="4185"/>
+        <w:gridCol w:w="6081"/>
+        <w:gridCol w:w="4588"/>
       </w:tblGrid>
       <w:tr>
         <w:trPr>
@@ -26515,7 +27829,7 @@
         <w:tc>
           <w:tcPr>
             <w:shd w:val="clear" w:color="auto" w:fill="DCE4F2"/>
-            <w:tcW w:w="4525" w:type="dxa"/>
+            <w:tcW w:w="4185" w:type="dxa"/>
           </w:tcPr>
           <w:tcPr/>
           <w:p>
@@ -26531,7 +27845,7 @@
         <w:tc>
           <w:tcPr>
             <w:shd w:val="clear" w:color="auto" w:fill="DCE4F2"/>
-            <w:tcW w:w="5369" w:type="dxa"/>
+            <w:tcW w:w="6081" w:type="dxa"/>
           </w:tcPr>
           <w:tcPr/>
           <w:p>
@@ -26547,7 +27861,7 @@
         <w:tc>
           <w:tcPr>
             <w:shd w:val="clear" w:color="auto" w:fill="DCE4F2"/>
-            <w:tcW w:w="4960" w:type="dxa"/>
+            <w:tcW w:w="4588" w:type="dxa"/>
           </w:tcPr>
           <w:tcPr/>
           <w:p>
@@ -26564,7 +27878,7 @@
       <w:tr>
         <w:tc>
           <w:tcPr>
-            <w:tcW w:w="4525" w:type="dxa"/>
+            <w:tcW w:w="4185" w:type="dxa"/>
           </w:tcPr>
           <w:tcPr/>
           <w:p>
@@ -26579,7 +27893,7 @@
         </w:tc>
         <w:tc>
           <w:tcPr>
-            <w:tcW w:w="5369" w:type="dxa"/>
+            <w:tcW w:w="6081" w:type="dxa"/>
           </w:tcPr>
           <w:tcPr/>
           <w:p>
@@ -26594,7 +27908,7 @@
         </w:tc>
         <w:tc>
           <w:tcPr>
-            <w:tcW w:w="4960" w:type="dxa"/>
+            <w:tcW w:w="4588" w:type="dxa"/>
           </w:tcPr>
           <w:tcPr/>
           <w:p>
@@ -26621,7 +27935,7 @@
       <w:tr>
         <w:tc>
           <w:tcPr>
-            <w:tcW w:w="4525" w:type="dxa"/>
+            <w:tcW w:w="4185" w:type="dxa"/>
           </w:tcPr>
           <w:tcPr/>
           <w:p>
@@ -26636,7 +27950,7 @@
         </w:tc>
         <w:tc>
           <w:tcPr>
-            <w:tcW w:w="5369" w:type="dxa"/>
+            <w:tcW w:w="6081" w:type="dxa"/>
           </w:tcPr>
           <w:tcPr/>
           <w:p>
@@ -26651,7 +27965,7 @@
         </w:tc>
         <w:tc>
           <w:tcPr>
-            <w:tcW w:w="4960" w:type="dxa"/>
+            <w:tcW w:w="4588" w:type="dxa"/>
           </w:tcPr>
           <w:tcPr/>
           <w:p>
@@ -26678,37 +27992,51 @@
       <w:tr>
         <w:tc>
           <w:tcPr>
-            <w:tcW w:w="4525" w:type="dxa"/>
-          </w:tcPr>
-          <w:tcPr/>
-          <w:p>
-            <w:pPr>
-              <w:pStyle w:val="Compact"/>
-              <w:jc w:val="left"/>
-            </w:pPr>
-            <w:r>
+            <w:tcW w:w="4185" w:type="dxa"/>
+          </w:tcPr>
+          <w:tcPr/>
+          <w:p>
+            <w:pPr>
+              <w:pStyle w:val="Compact"/>
+              <w:jc w:val="left"/>
+            </w:pPr>
+            <w:r>
+              <w:rPr>
+                <w:bCs/>
+                <w:b/>
+              </w:rPr>
               <w:t xml:space="preserve">27.07.2026</w:t>
             </w:r>
           </w:p>
         </w:tc>
         <w:tc>
           <w:tcPr>
-            <w:tcW w:w="5369" w:type="dxa"/>
-          </w:tcPr>
-          <w:tcPr/>
-          <w:p>
-            <w:pPr>
-              <w:pStyle w:val="Compact"/>
-              <w:jc w:val="left"/>
-            </w:pPr>
-            <w:r>
-              <w:t xml:space="preserve">Digital Omnibus in Kraft; Art. 102–110 KI-VO anwendbar</w:t>
-            </w:r>
-          </w:p>
-        </w:tc>
-        <w:tc>
-          <w:tcPr>
-            <w:tcW w:w="4960" w:type="dxa"/>
+            <w:tcW w:w="6081" w:type="dxa"/>
+          </w:tcPr>
+          <w:tcPr/>
+          <w:p>
+            <w:pPr>
+              <w:pStyle w:val="Compact"/>
+              <w:jc w:val="left"/>
+            </w:pPr>
+            <w:r>
+              <w:t xml:space="preserve">Digital Omnibus in Kraft; Art. 102–110 KI-VO anwendbar;</w:t>
+            </w:r>
+            <w:r>
+              <w:t xml:space="preserve"> </w:t>
+            </w:r>
+            <w:r>
+              <w:rPr>
+                <w:bCs/>
+                <w:b/>
+              </w:rPr>
+              <w:t xml:space="preserve">Art. 4a (Bias-Erkennung mit besonderen Datenkategorien) anwendbar</w:t>
+            </w:r>
+          </w:p>
+        </w:tc>
+        <w:tc>
+          <w:tcPr>
+            <w:tcW w:w="4588" w:type="dxa"/>
           </w:tcPr>
           <w:tcPr/>
           <w:p>
@@ -26725,7 +28053,7 @@
       <w:tr>
         <w:tc>
           <w:tcPr>
-            <w:tcW w:w="4525" w:type="dxa"/>
+            <w:tcW w:w="4185" w:type="dxa"/>
           </w:tcPr>
           <w:tcPr/>
           <w:p>
@@ -26744,7 +28072,7 @@
         </w:tc>
         <w:tc>
           <w:tcPr>
-            <w:tcW w:w="5369" w:type="dxa"/>
+            <w:tcW w:w="6081" w:type="dxa"/>
           </w:tcPr>
           <w:tcPr/>
           <w:p>
@@ -26766,7 +28094,7 @@
         </w:tc>
         <w:tc>
           <w:tcPr>
-            <w:tcW w:w="4960" w:type="dxa"/>
+            <w:tcW w:w="4588" w:type="dxa"/>
           </w:tcPr>
           <w:tcPr/>
           <w:p>
@@ -26787,7 +28115,7 @@
       <w:tr>
         <w:tc>
           <w:tcPr>
-            <w:tcW w:w="4525" w:type="dxa"/>
+            <w:tcW w:w="4185" w:type="dxa"/>
           </w:tcPr>
           <w:tcPr/>
           <w:p>
@@ -26806,7 +28134,7 @@
         </w:tc>
         <w:tc>
           <w:tcPr>
-            <w:tcW w:w="5369" w:type="dxa"/>
+            <w:tcW w:w="6081" w:type="dxa"/>
           </w:tcPr>
           <w:tcPr/>
           <w:p>
@@ -26825,7 +28153,7 @@
         </w:tc>
         <w:tc>
           <w:tcPr>
-            <w:tcW w:w="4960" w:type="dxa"/>
+            <w:tcW w:w="4588" w:type="dxa"/>
           </w:tcPr>
           <w:tcPr/>
           <w:p>
@@ -26846,7 +28174,7 @@
       <w:tr>
         <w:tc>
           <w:tcPr>
-            <w:tcW w:w="4525" w:type="dxa"/>
+            <w:tcW w:w="4185" w:type="dxa"/>
           </w:tcPr>
           <w:tcPr/>
           <w:p>
@@ -26865,7 +28193,7 @@
         </w:tc>
         <w:tc>
           <w:tcPr>
-            <w:tcW w:w="5369" w:type="dxa"/>
+            <w:tcW w:w="6081" w:type="dxa"/>
           </w:tcPr>
           <w:tcPr/>
           <w:p>
@@ -26884,7 +28212,7 @@
         </w:tc>
         <w:tc>
           <w:tcPr>
-            <w:tcW w:w="4960" w:type="dxa"/>
+            <w:tcW w:w="4588" w:type="dxa"/>
           </w:tcPr>
           <w:tcPr/>
           <w:p>
@@ -26905,7 +28233,7 @@
       <w:tr>
         <w:tc>
           <w:tcPr>
-            <w:tcW w:w="4525" w:type="dxa"/>
+            <w:tcW w:w="4185" w:type="dxa"/>
           </w:tcPr>
           <w:tcPr/>
           <w:p>
@@ -26920,7 +28248,7 @@
         </w:tc>
         <w:tc>
           <w:tcPr>
-            <w:tcW w:w="5369" w:type="dxa"/>
+            <w:tcW w:w="6081" w:type="dxa"/>
           </w:tcPr>
           <w:tcPr/>
           <w:p>
@@ -26935,7 +28263,7 @@
         </w:tc>
         <w:tc>
           <w:tcPr>
-            <w:tcW w:w="4960" w:type="dxa"/>
+            <w:tcW w:w="4588" w:type="dxa"/>
           </w:tcPr>
           <w:tcPr/>
           <w:p>
@@ -26952,7 +28280,7 @@
       <w:tr>
         <w:tc>
           <w:tcPr>
-            <w:tcW w:w="4525" w:type="dxa"/>
+            <w:tcW w:w="4185" w:type="dxa"/>
           </w:tcPr>
           <w:tcPr/>
           <w:p>
@@ -26971,7 +28299,7 @@
         </w:tc>
         <w:tc>
           <w:tcPr>
-            <w:tcW w:w="5369" w:type="dxa"/>
+            <w:tcW w:w="6081" w:type="dxa"/>
           </w:tcPr>
           <w:tcPr/>
           <w:p>
@@ -26990,7 +28318,7 @@
         </w:tc>
         <w:tc>
           <w:tcPr>
-            <w:tcW w:w="4960" w:type="dxa"/>
+            <w:tcW w:w="4588" w:type="dxa"/>
           </w:tcPr>
           <w:tcPr/>
           <w:p>
@@ -27011,7 +28339,7 @@
       <w:tr>
         <w:tc>
           <w:tcPr>
-            <w:tcW w:w="4525" w:type="dxa"/>
+            <w:tcW w:w="4185" w:type="dxa"/>
           </w:tcPr>
           <w:tcPr/>
           <w:p>
@@ -27030,7 +28358,7 @@
         </w:tc>
         <w:tc>
           <w:tcPr>
-            <w:tcW w:w="5369" w:type="dxa"/>
+            <w:tcW w:w="6081" w:type="dxa"/>
           </w:tcPr>
           <w:tcPr/>
           <w:p>
@@ -27043,13 +28371,19 @@
                 <w:bCs/>
                 <w:b/>
               </w:rPr>
-              <w:t xml:space="preserve">Hochrisiko-Pflichten Anhang I</w:t>
-            </w:r>
-          </w:p>
-        </w:tc>
-        <w:tc>
-          <w:tcPr>
-            <w:tcW w:w="4960" w:type="dxa"/>
+              <w:t xml:space="preserve">Hochrisiko-Pflichten Anhang I Abschnitt A.</w:t>
+            </w:r>
+            <w:r>
+              <w:t xml:space="preserve"> </w:t>
+            </w:r>
+            <w:r>
+              <w:t xml:space="preserve">Für Abschnitt B gelten nur Art. 6 Abs. 1, Art. 60a und Art. 102–112 (Art. 2 Abs. 2 n. F.); dort greift das Sektorrecht</w:t>
+            </w:r>
+          </w:p>
+        </w:tc>
+        <w:tc>
+          <w:tcPr>
+            <w:tcW w:w="4588" w:type="dxa"/>
           </w:tcPr>
           <w:tcPr/>
           <w:p>
@@ -27070,7 +28404,7 @@
       <w:tr>
         <w:tc>
           <w:tcPr>
-            <w:tcW w:w="4525" w:type="dxa"/>
+            <w:tcW w:w="4185" w:type="dxa"/>
           </w:tcPr>
           <w:tcPr/>
           <w:p>
@@ -27085,7 +28419,7 @@
         </w:tc>
         <w:tc>
           <w:tcPr>
-            <w:tcW w:w="5369" w:type="dxa"/>
+            <w:tcW w:w="6081" w:type="dxa"/>
           </w:tcPr>
           <w:tcPr/>
           <w:p>
@@ -27100,7 +28434,7 @@
         </w:tc>
         <w:tc>
           <w:tcPr>
-            <w:tcW w:w="4960" w:type="dxa"/>
+            <w:tcW w:w="4588" w:type="dxa"/>
           </w:tcPr>
           <w:tcPr/>
           <w:p>
@@ -27117,7 +28451,7 @@
       <w:tr>
         <w:tc>
           <w:tcPr>
-            <w:tcW w:w="4525" w:type="dxa"/>
+            <w:tcW w:w="4185" w:type="dxa"/>
           </w:tcPr>
           <w:tcPr/>
           <w:p>
@@ -27132,7 +28466,7 @@
         </w:tc>
         <w:tc>
           <w:tcPr>
-            <w:tcW w:w="5369" w:type="dxa"/>
+            <w:tcW w:w="6081" w:type="dxa"/>
           </w:tcPr>
           <w:tcPr/>
           <w:p>
@@ -27147,7 +28481,7 @@
         </w:tc>
         <w:tc>
           <w:tcPr>
-            <w:tcW w:w="4960" w:type="dxa"/>
+            <w:tcW w:w="4588" w:type="dxa"/>
           </w:tcPr>
           <w:tcPr/>
           <w:p>
@@ -27164,7 +28498,7 @@
       <w:tr>
         <w:tc>
           <w:tcPr>
-            <w:tcW w:w="4525" w:type="dxa"/>
+            <w:tcW w:w="4185" w:type="dxa"/>
           </w:tcPr>
           <w:tcPr/>
           <w:p>
@@ -27179,7 +28513,7 @@
         </w:tc>
         <w:tc>
           <w:tcPr>
-            <w:tcW w:w="5369" w:type="dxa"/>
+            <w:tcW w:w="6081" w:type="dxa"/>
           </w:tcPr>
           <w:tcPr/>
           <w:p>
@@ -27194,7 +28528,7 @@
         </w:tc>
         <w:tc>
           <w:tcPr>
-            <w:tcW w:w="4960" w:type="dxa"/>
+            <w:tcW w:w="4588" w:type="dxa"/>
           </w:tcPr>
           <w:tcPr/>
           <w:p>
@@ -27217,7 +28551,7 @@
       </w:r>
     </w:p>
     <w:bookmarkEnd w:id="57"/>
-    <w:bookmarkStart w:id="58" w:name="anhang-bußgeldrahmen"/>
+    <w:bookmarkStart w:id="59" w:name="anhang-bußgeldrahmen"/>
     <w:p>
       <w:pPr>
         <w:pStyle w:val="Heading1"/>
@@ -27749,7 +29083,7 @@
           <w:iCs/>
           <w:i/>
         </w:rPr>
-        <w:t xml:space="preserve">Erstellt am 29. Juli 2026. Rechtsstand: 29. Juli 2026.</w:t>
+        <w:t xml:space="preserve">Fassung 1.1 · Erstellt am 29.07.2026 · Rechtsstand: 29.07.2026</w:t>
       </w:r>
       <w:r>
         <w:t xml:space="preserve"> </w:t>
@@ -27759,7 +29093,7 @@
           <w:iCs/>
           <w:i/>
         </w:rPr>
-        <w:t xml:space="preserve">Diese Checklisten ersetzen keine Rechtsberatung im Einzelfall.</w:t>
+        <w:t xml:space="preserve">Diese Checklisten ersetzen keine Rechtsberatung im Einzelfall. Nutzung unter CC BY 4.0 — bei Weitergabe bitte Rechtsstand und vorgenommene Änderungen kennzeichnen.</w:t>
       </w:r>
       <w:r>
         <w:t xml:space="preserve"> </w:t>
@@ -27769,10 +29103,56 @@
           <w:iCs/>
           <w:i/>
         </w:rPr>
-        <w:t xml:space="preserve">Vollständiges Quellenverzeichnis: siehe Quellenregister.md dieses Dokumentenpakets.</w:t>
-      </w:r>
+        <w:t xml:space="preserve">Vollständiges Quellenverzeichnis mit Prüfstatus:</w:t>
+      </w:r>
+      <w:r>
+        <w:rPr>
+          <w:iCs/>
+          <w:i/>
+        </w:rPr>
+        <w:t xml:space="preserve"> </w:t>
+      </w:r>
+      <w:r>
+        <w:rPr>
+          <w:rStyle w:val="VerbatimChar"/>
+          <w:iCs/>
+          <w:i/>
+        </w:rPr>
+        <w:t xml:space="preserve">QUELLEN.md</w:t>
+      </w:r>
+      <w:r>
+        <w:rPr>
+          <w:iCs/>
+          <w:i/>
+        </w:rPr>
+        <w:t xml:space="preserve"> </w:t>
+      </w:r>
+      <w:r>
+        <w:rPr>
+          <w:iCs/>
+          <w:i/>
+        </w:rPr>
+        <w:t xml:space="preserve">—</w:t>
+      </w:r>
+      <w:r>
+        <w:rPr>
+          <w:iCs/>
+          <w:i/>
+        </w:rPr>
+        <w:t xml:space="preserve"> </w:t>
+      </w:r>
+      <w:hyperlink r:id="rId58">
+        <w:r>
+          <w:rPr>
+            <w:rStyle w:val="Hyperlink"/>
+            <w:iCs/>
+            <w:i/>
+          </w:rPr>
+          <w:t xml:space="preserve">https://github.com/thomas-lauer/eu-ai-act/blob/main/QUELLEN.md</w:t>
+        </w:r>
+      </w:hyperlink>
     </w:p>
-    <w:bookmarkEnd w:id="58"/>
+    <w:bookmarkEnd w:id="59"/>
     <w:sectPr>
       <w:pgSz w:w="16838" w:h="11906" w:orient="landscape"/>
       <w:pgMar w:top="992" w:right="992" w:bottom="992" w:left="992" w:header="567" w:footer="567" w:gutter="0"/>

</xml_diff>